<commit_message>
feat: ship official rulebook, table nullify targeting, and launch rule hardening
Make the shared chip and energy contracts public and fail-closed, let players pick nullify targets on the board, and add a searchable official handbook in lobby and settings.

Co-authored-by: Cursor <cursoragent@cursor.com>
</commit_message>
<xml_diff>
--- a/docs/超限德州-技能系统现行规则.docx
+++ b/docs/超限德州-技能系统现行规则.docx
@@ -668,7 +668,7 @@
                 <w:color w:val="1A243A"/>
                 <w:sz w:val="18"/>
               </w:rPr>
-              <w:t>definitions.js / skillConfig.js / skillEngine.js / skillState.js / gameEngine.js</w:t>
+              <w:t>definitions.js / skillConfig.js / skillEngine.js / skillState.js / gameEngine.js / chipEconomy.js / handRankBonus.js</w:t>
             </w:r>
           </w:p>
         </w:tc>
@@ -1349,6 +1349,1414 @@
         </w:rPr>
         <w:t>1. 全局规则</w:t>
       </w:r>
+    </w:p>
+    <w:p>
+      <w:pPr>
+        <w:keepNext/>
+        <w:spacing w:before="240" w:after="120" w:line="400" w:lineRule="exact"/>
+      </w:pPr>
+      <w:r>
+        <w:rPr>
+          <w:rFonts w:ascii="微软雅黑" w:hAnsi="微软雅黑" w:eastAsia="微软雅黑"/>
+          <w:b/>
+          <w:i w:val="0"/>
+          <w:color w:val="8B1E2D"/>
+          <w:sz w:val="26"/>
+        </w:rPr>
+        <w:t>1.0 全模式基础经济与牌型奖励</w:t>
+      </w:r>
+    </w:p>
+    <w:p>
+      <w:pPr>
+        <w:spacing w:before="0" w:after="120" w:line="360" w:lineRule="exact"/>
+        <w:ind w:firstLine="0"/>
+      </w:pPr>
+      <w:r>
+        <w:rPr>
+          <w:rFonts w:ascii="微软雅黑" w:hAnsi="微软雅黑" w:eastAsia="微软雅黑"/>
+          <w:b w:val="0"/>
+          <w:i w:val="0"/>
+          <w:color w:val="1A243A"/>
+          <w:sz w:val="21"/>
+        </w:rPr>
+        <w:t>牌型基础奖励属于《超限德州》的游戏基础经济规则，不是技能效果。无论 standard + skill off、overdrive + skill off、standard + skill on、overdrive + skill on，只要最终通过 Showdown 决出胜者，就发放 launch-v1 牌型基础奖励。关闭技能只代表不启用技能系统，并不代表完全原版 Texas Hold'em。</w:t>
+      </w:r>
+    </w:p>
+    <w:tbl>
+      <w:tblPr>
+        <w:tblW w:type="auto" w:w="0"/>
+        <w:jc w:val="center"/>
+        <w:tblLayout w:type="fixed"/>
+        <w:tblLook w:firstColumn="1" w:firstRow="1" w:lastColumn="0" w:lastRow="0" w:noHBand="0" w:noVBand="1" w:val="04A0"/>
+        <w:tblW w:w="0" w:type="auto"/>
+      </w:tblPr>
+      <w:tblGrid>
+        <w:gridCol w:w="3137"/>
+        <w:gridCol w:w="3137"/>
+        <w:gridCol w:w="3137"/>
+      </w:tblGrid>
+      <w:tr>
+        <w:trPr>
+          <w:cantSplit/>
+        </w:trPr>
+        <w:tc>
+          <w:tcPr>
+            <w:tcW w:type="dxa" w:w="2268"/>
+            <w:shd w:fill="1A243A" w:val="clear"/>
+            <w:tcBorders>
+              <w:top w:val="single" w:sz="4" w:space="0" w:color="C8BFA8"/>
+              <w:left w:val="single" w:sz="4" w:space="0" w:color="C8BFA8"/>
+              <w:bottom w:val="single" w:sz="4" w:space="0" w:color="C8BFA8"/>
+              <w:right w:val="single" w:sz="4" w:space="0" w:color="C8BFA8"/>
+            </w:tcBorders>
+            <w:tcMar>
+              <w:top w:w="40" w:type="dxa"/>
+              <w:left w:w="80" w:type="dxa"/>
+              <w:bottom w:w="40" w:type="dxa"/>
+              <w:right w:w="80" w:type="dxa"/>
+            </w:tcMar>
+            <w:vAlign w:val="center"/>
+          </w:tcPr>
+          <w:p>
+            <w:pPr>
+              <w:spacing w:before="0" w:after="0" w:line="320" w:lineRule="exact"/>
+              <w:jc w:val="center"/>
+            </w:pPr>
+            <w:r/>
+            <w:r>
+              <w:rPr>
+                <w:rFonts w:ascii="微软雅黑" w:hAnsi="微软雅黑" w:eastAsia="微软雅黑"/>
+                <w:b/>
+                <w:i w:val="0"/>
+                <w:color w:val="FFFFFF"/>
+                <w:sz w:val="18"/>
+              </w:rPr>
+              <w:t>牌型</w:t>
+            </w:r>
+          </w:p>
+        </w:tc>
+        <w:tc>
+          <w:tcPr>
+            <w:tcW w:type="dxa" w:w="1361"/>
+            <w:shd w:fill="1A243A" w:val="clear"/>
+            <w:tcBorders>
+              <w:top w:val="single" w:sz="4" w:space="0" w:color="C8BFA8"/>
+              <w:left w:val="single" w:sz="4" w:space="0" w:color="C8BFA8"/>
+              <w:bottom w:val="single" w:sz="4" w:space="0" w:color="C8BFA8"/>
+              <w:right w:val="single" w:sz="4" w:space="0" w:color="C8BFA8"/>
+            </w:tcBorders>
+            <w:tcMar>
+              <w:top w:w="40" w:type="dxa"/>
+              <w:left w:w="80" w:type="dxa"/>
+              <w:bottom w:w="40" w:type="dxa"/>
+              <w:right w:w="80" w:type="dxa"/>
+            </w:tcMar>
+            <w:vAlign w:val="center"/>
+          </w:tcPr>
+          <w:p>
+            <w:pPr>
+              <w:spacing w:before="0" w:after="0" w:line="320" w:lineRule="exact"/>
+              <w:jc w:val="center"/>
+            </w:pPr>
+            <w:r/>
+            <w:r>
+              <w:rPr>
+                <w:rFonts w:ascii="微软雅黑" w:hAnsi="微软雅黑" w:eastAsia="微软雅黑"/>
+                <w:b/>
+                <w:i w:val="0"/>
+                <w:color w:val="FFFFFF"/>
+                <w:sz w:val="18"/>
+              </w:rPr>
+              <w:t>category</w:t>
+            </w:r>
+          </w:p>
+        </w:tc>
+        <w:tc>
+          <w:tcPr>
+            <w:tcW w:type="dxa" w:w="5669"/>
+            <w:shd w:fill="1A243A" w:val="clear"/>
+            <w:tcBorders>
+              <w:top w:val="single" w:sz="4" w:space="0" w:color="C8BFA8"/>
+              <w:left w:val="single" w:sz="4" w:space="0" w:color="C8BFA8"/>
+              <w:bottom w:val="single" w:sz="4" w:space="0" w:color="C8BFA8"/>
+              <w:right w:val="single" w:sz="4" w:space="0" w:color="C8BFA8"/>
+            </w:tcBorders>
+            <w:tcMar>
+              <w:top w:w="40" w:type="dxa"/>
+              <w:left w:w="80" w:type="dxa"/>
+              <w:bottom w:w="40" w:type="dxa"/>
+              <w:right w:w="80" w:type="dxa"/>
+            </w:tcMar>
+            <w:vAlign w:val="center"/>
+          </w:tcPr>
+          <w:p>
+            <w:pPr>
+              <w:spacing w:before="0" w:after="0" w:line="320" w:lineRule="exact"/>
+              <w:jc w:val="center"/>
+            </w:pPr>
+            <w:r/>
+            <w:r>
+              <w:rPr>
+                <w:rFonts w:ascii="微软雅黑" w:hAnsi="微软雅黑" w:eastAsia="微软雅黑"/>
+                <w:b/>
+                <w:i w:val="0"/>
+                <w:color w:val="FFFFFF"/>
+                <w:sz w:val="18"/>
+              </w:rPr>
+              <w:t>奖励</w:t>
+            </w:r>
+          </w:p>
+        </w:tc>
+      </w:tr>
+      <w:tr>
+        <w:trPr>
+          <w:cantSplit/>
+        </w:trPr>
+        <w:tc>
+          <w:tcPr>
+            <w:tcW w:type="dxa" w:w="2268"/>
+            <w:shd w:fill="FFFFFF" w:val="clear"/>
+            <w:tcBorders>
+              <w:top w:val="single" w:sz="4" w:space="0" w:color="C8BFA8"/>
+              <w:left w:val="single" w:sz="4" w:space="0" w:color="C8BFA8"/>
+              <w:bottom w:val="single" w:sz="4" w:space="0" w:color="C8BFA8"/>
+              <w:right w:val="single" w:sz="4" w:space="0" w:color="C8BFA8"/>
+            </w:tcBorders>
+            <w:tcMar>
+              <w:top w:w="40" w:type="dxa"/>
+              <w:left w:w="80" w:type="dxa"/>
+              <w:bottom w:w="40" w:type="dxa"/>
+              <w:right w:w="80" w:type="dxa"/>
+            </w:tcMar>
+            <w:vAlign w:val="center"/>
+          </w:tcPr>
+          <w:p>
+            <w:pPr>
+              <w:spacing w:before="0" w:after="0" w:line="320" w:lineRule="exact"/>
+              <w:jc w:val="center"/>
+            </w:pPr>
+            <w:r/>
+            <w:r>
+              <w:rPr>
+                <w:rFonts w:ascii="微软雅黑" w:hAnsi="微软雅黑" w:eastAsia="微软雅黑"/>
+                <w:b w:val="0"/>
+                <w:i w:val="0"/>
+                <w:color w:val="1A243A"/>
+                <w:sz w:val="18"/>
+              </w:rPr>
+              <w:t>高牌</w:t>
+            </w:r>
+          </w:p>
+        </w:tc>
+        <w:tc>
+          <w:tcPr>
+            <w:tcW w:type="dxa" w:w="1361"/>
+            <w:shd w:fill="FFFFFF" w:val="clear"/>
+            <w:tcBorders>
+              <w:top w:val="single" w:sz="4" w:space="0" w:color="C8BFA8"/>
+              <w:left w:val="single" w:sz="4" w:space="0" w:color="C8BFA8"/>
+              <w:bottom w:val="single" w:sz="4" w:space="0" w:color="C8BFA8"/>
+              <w:right w:val="single" w:sz="4" w:space="0" w:color="C8BFA8"/>
+            </w:tcBorders>
+            <w:tcMar>
+              <w:top w:w="40" w:type="dxa"/>
+              <w:left w:w="80" w:type="dxa"/>
+              <w:bottom w:w="40" w:type="dxa"/>
+              <w:right w:w="80" w:type="dxa"/>
+            </w:tcMar>
+            <w:vAlign w:val="center"/>
+          </w:tcPr>
+          <w:p>
+            <w:pPr>
+              <w:spacing w:before="0" w:after="0" w:line="320" w:lineRule="exact"/>
+              <w:jc w:val="center"/>
+            </w:pPr>
+            <w:r/>
+            <w:r>
+              <w:rPr>
+                <w:rFonts w:ascii="微软雅黑" w:hAnsi="微软雅黑" w:eastAsia="微软雅黑"/>
+                <w:b w:val="0"/>
+                <w:i w:val="0"/>
+                <w:color w:val="1A243A"/>
+                <w:sz w:val="18"/>
+              </w:rPr>
+              <w:t>1</w:t>
+            </w:r>
+          </w:p>
+        </w:tc>
+        <w:tc>
+          <w:tcPr>
+            <w:tcW w:type="dxa" w:w="5669"/>
+            <w:shd w:fill="FFFFFF" w:val="clear"/>
+            <w:tcBorders>
+              <w:top w:val="single" w:sz="4" w:space="0" w:color="C8BFA8"/>
+              <w:left w:val="single" w:sz="4" w:space="0" w:color="C8BFA8"/>
+              <w:bottom w:val="single" w:sz="4" w:space="0" w:color="C8BFA8"/>
+              <w:right w:val="single" w:sz="4" w:space="0" w:color="C8BFA8"/>
+            </w:tcBorders>
+            <w:tcMar>
+              <w:top w:w="40" w:type="dxa"/>
+              <w:left w:w="80" w:type="dxa"/>
+              <w:bottom w:w="40" w:type="dxa"/>
+              <w:right w:w="80" w:type="dxa"/>
+            </w:tcMar>
+            <w:vAlign w:val="center"/>
+          </w:tcPr>
+          <w:p>
+            <w:pPr>
+              <w:spacing w:before="0" w:after="0" w:line="320" w:lineRule="exact"/>
+              <w:jc w:val="left"/>
+            </w:pPr>
+            <w:r/>
+            <w:r>
+              <w:rPr>
+                <w:rFonts w:ascii="微软雅黑" w:hAnsi="微软雅黑" w:eastAsia="微软雅黑"/>
+                <w:b w:val="0"/>
+                <w:i w:val="0"/>
+                <w:color w:val="1A243A"/>
+                <w:sz w:val="18"/>
+              </w:rPr>
+              <w:t>+0</w:t>
+            </w:r>
+          </w:p>
+        </w:tc>
+      </w:tr>
+      <w:tr>
+        <w:trPr>
+          <w:cantSplit/>
+        </w:trPr>
+        <w:tc>
+          <w:tcPr>
+            <w:tcW w:type="dxa" w:w="2268"/>
+            <w:shd w:fill="FFFFFF" w:val="clear"/>
+            <w:tcBorders>
+              <w:top w:val="single" w:sz="4" w:space="0" w:color="C8BFA8"/>
+              <w:left w:val="single" w:sz="4" w:space="0" w:color="C8BFA8"/>
+              <w:bottom w:val="single" w:sz="4" w:space="0" w:color="C8BFA8"/>
+              <w:right w:val="single" w:sz="4" w:space="0" w:color="C8BFA8"/>
+            </w:tcBorders>
+            <w:tcMar>
+              <w:top w:w="40" w:type="dxa"/>
+              <w:left w:w="80" w:type="dxa"/>
+              <w:bottom w:w="40" w:type="dxa"/>
+              <w:right w:w="80" w:type="dxa"/>
+            </w:tcMar>
+            <w:vAlign w:val="center"/>
+            <w:shd w:fill="F4F1EA" w:val="clear"/>
+          </w:tcPr>
+          <w:p>
+            <w:pPr>
+              <w:spacing w:before="0" w:after="0" w:line="320" w:lineRule="exact"/>
+              <w:jc w:val="center"/>
+            </w:pPr>
+            <w:r/>
+            <w:r>
+              <w:rPr>
+                <w:rFonts w:ascii="微软雅黑" w:hAnsi="微软雅黑" w:eastAsia="微软雅黑"/>
+                <w:b w:val="0"/>
+                <w:i w:val="0"/>
+                <w:color w:val="1A243A"/>
+                <w:sz w:val="18"/>
+              </w:rPr>
+              <w:t>一对</w:t>
+            </w:r>
+          </w:p>
+        </w:tc>
+        <w:tc>
+          <w:tcPr>
+            <w:tcW w:type="dxa" w:w="1361"/>
+            <w:shd w:fill="FFFFFF" w:val="clear"/>
+            <w:tcBorders>
+              <w:top w:val="single" w:sz="4" w:space="0" w:color="C8BFA8"/>
+              <w:left w:val="single" w:sz="4" w:space="0" w:color="C8BFA8"/>
+              <w:bottom w:val="single" w:sz="4" w:space="0" w:color="C8BFA8"/>
+              <w:right w:val="single" w:sz="4" w:space="0" w:color="C8BFA8"/>
+            </w:tcBorders>
+            <w:tcMar>
+              <w:top w:w="40" w:type="dxa"/>
+              <w:left w:w="80" w:type="dxa"/>
+              <w:bottom w:w="40" w:type="dxa"/>
+              <w:right w:w="80" w:type="dxa"/>
+            </w:tcMar>
+            <w:vAlign w:val="center"/>
+            <w:shd w:fill="F4F1EA" w:val="clear"/>
+          </w:tcPr>
+          <w:p>
+            <w:pPr>
+              <w:spacing w:before="0" w:after="0" w:line="320" w:lineRule="exact"/>
+              <w:jc w:val="center"/>
+            </w:pPr>
+            <w:r/>
+            <w:r>
+              <w:rPr>
+                <w:rFonts w:ascii="微软雅黑" w:hAnsi="微软雅黑" w:eastAsia="微软雅黑"/>
+                <w:b w:val="0"/>
+                <w:i w:val="0"/>
+                <w:color w:val="1A243A"/>
+                <w:sz w:val="18"/>
+              </w:rPr>
+              <w:t>2</w:t>
+            </w:r>
+          </w:p>
+        </w:tc>
+        <w:tc>
+          <w:tcPr>
+            <w:tcW w:type="dxa" w:w="5669"/>
+            <w:shd w:fill="FFFFFF" w:val="clear"/>
+            <w:tcBorders>
+              <w:top w:val="single" w:sz="4" w:space="0" w:color="C8BFA8"/>
+              <w:left w:val="single" w:sz="4" w:space="0" w:color="C8BFA8"/>
+              <w:bottom w:val="single" w:sz="4" w:space="0" w:color="C8BFA8"/>
+              <w:right w:val="single" w:sz="4" w:space="0" w:color="C8BFA8"/>
+            </w:tcBorders>
+            <w:tcMar>
+              <w:top w:w="40" w:type="dxa"/>
+              <w:left w:w="80" w:type="dxa"/>
+              <w:bottom w:w="40" w:type="dxa"/>
+              <w:right w:w="80" w:type="dxa"/>
+            </w:tcMar>
+            <w:vAlign w:val="center"/>
+            <w:shd w:fill="F4F1EA" w:val="clear"/>
+          </w:tcPr>
+          <w:p>
+            <w:pPr>
+              <w:spacing w:before="0" w:after="0" w:line="320" w:lineRule="exact"/>
+              <w:jc w:val="left"/>
+            </w:pPr>
+            <w:r/>
+            <w:r>
+              <w:rPr>
+                <w:rFonts w:ascii="微软雅黑" w:hAnsi="微软雅黑" w:eastAsia="微软雅黑"/>
+                <w:b w:val="0"/>
+                <w:i w:val="0"/>
+                <w:color w:val="1A243A"/>
+                <w:sz w:val="18"/>
+              </w:rPr>
+              <w:t>+0</w:t>
+            </w:r>
+          </w:p>
+        </w:tc>
+      </w:tr>
+      <w:tr>
+        <w:trPr>
+          <w:cantSplit/>
+        </w:trPr>
+        <w:tc>
+          <w:tcPr>
+            <w:tcW w:type="dxa" w:w="2268"/>
+            <w:shd w:fill="FFFFFF" w:val="clear"/>
+            <w:tcBorders>
+              <w:top w:val="single" w:sz="4" w:space="0" w:color="C8BFA8"/>
+              <w:left w:val="single" w:sz="4" w:space="0" w:color="C8BFA8"/>
+              <w:bottom w:val="single" w:sz="4" w:space="0" w:color="C8BFA8"/>
+              <w:right w:val="single" w:sz="4" w:space="0" w:color="C8BFA8"/>
+            </w:tcBorders>
+            <w:tcMar>
+              <w:top w:w="40" w:type="dxa"/>
+              <w:left w:w="80" w:type="dxa"/>
+              <w:bottom w:w="40" w:type="dxa"/>
+              <w:right w:w="80" w:type="dxa"/>
+            </w:tcMar>
+            <w:vAlign w:val="center"/>
+          </w:tcPr>
+          <w:p>
+            <w:pPr>
+              <w:spacing w:before="0" w:after="0" w:line="320" w:lineRule="exact"/>
+              <w:jc w:val="center"/>
+            </w:pPr>
+            <w:r/>
+            <w:r>
+              <w:rPr>
+                <w:rFonts w:ascii="微软雅黑" w:hAnsi="微软雅黑" w:eastAsia="微软雅黑"/>
+                <w:b w:val="0"/>
+                <w:i w:val="0"/>
+                <w:color w:val="1A243A"/>
+                <w:sz w:val="18"/>
+              </w:rPr>
+              <w:t>两对</w:t>
+            </w:r>
+          </w:p>
+        </w:tc>
+        <w:tc>
+          <w:tcPr>
+            <w:tcW w:type="dxa" w:w="1361"/>
+            <w:shd w:fill="FFFFFF" w:val="clear"/>
+            <w:tcBorders>
+              <w:top w:val="single" w:sz="4" w:space="0" w:color="C8BFA8"/>
+              <w:left w:val="single" w:sz="4" w:space="0" w:color="C8BFA8"/>
+              <w:bottom w:val="single" w:sz="4" w:space="0" w:color="C8BFA8"/>
+              <w:right w:val="single" w:sz="4" w:space="0" w:color="C8BFA8"/>
+            </w:tcBorders>
+            <w:tcMar>
+              <w:top w:w="40" w:type="dxa"/>
+              <w:left w:w="80" w:type="dxa"/>
+              <w:bottom w:w="40" w:type="dxa"/>
+              <w:right w:w="80" w:type="dxa"/>
+            </w:tcMar>
+            <w:vAlign w:val="center"/>
+          </w:tcPr>
+          <w:p>
+            <w:pPr>
+              <w:spacing w:before="0" w:after="0" w:line="320" w:lineRule="exact"/>
+              <w:jc w:val="center"/>
+            </w:pPr>
+            <w:r/>
+            <w:r>
+              <w:rPr>
+                <w:rFonts w:ascii="微软雅黑" w:hAnsi="微软雅黑" w:eastAsia="微软雅黑"/>
+                <w:b w:val="0"/>
+                <w:i w:val="0"/>
+                <w:color w:val="1A243A"/>
+                <w:sz w:val="18"/>
+              </w:rPr>
+              <w:t>3</w:t>
+            </w:r>
+          </w:p>
+        </w:tc>
+        <w:tc>
+          <w:tcPr>
+            <w:tcW w:type="dxa" w:w="5669"/>
+            <w:shd w:fill="FFFFFF" w:val="clear"/>
+            <w:tcBorders>
+              <w:top w:val="single" w:sz="4" w:space="0" w:color="C8BFA8"/>
+              <w:left w:val="single" w:sz="4" w:space="0" w:color="C8BFA8"/>
+              <w:bottom w:val="single" w:sz="4" w:space="0" w:color="C8BFA8"/>
+              <w:right w:val="single" w:sz="4" w:space="0" w:color="C8BFA8"/>
+            </w:tcBorders>
+            <w:tcMar>
+              <w:top w:w="40" w:type="dxa"/>
+              <w:left w:w="80" w:type="dxa"/>
+              <w:bottom w:w="40" w:type="dxa"/>
+              <w:right w:w="80" w:type="dxa"/>
+            </w:tcMar>
+            <w:vAlign w:val="center"/>
+          </w:tcPr>
+          <w:p>
+            <w:pPr>
+              <w:spacing w:before="0" w:after="0" w:line="320" w:lineRule="exact"/>
+              <w:jc w:val="left"/>
+            </w:pPr>
+            <w:r/>
+            <w:r>
+              <w:rPr>
+                <w:rFonts w:ascii="微软雅黑" w:hAnsi="微软雅黑" w:eastAsia="微软雅黑"/>
+                <w:b w:val="0"/>
+                <w:i w:val="0"/>
+                <w:color w:val="1A243A"/>
+                <w:sz w:val="18"/>
+              </w:rPr>
+              <w:t>+0</w:t>
+            </w:r>
+          </w:p>
+        </w:tc>
+      </w:tr>
+      <w:tr>
+        <w:trPr>
+          <w:cantSplit/>
+        </w:trPr>
+        <w:tc>
+          <w:tcPr>
+            <w:tcW w:type="dxa" w:w="2268"/>
+            <w:shd w:fill="FFFFFF" w:val="clear"/>
+            <w:tcBorders>
+              <w:top w:val="single" w:sz="4" w:space="0" w:color="C8BFA8"/>
+              <w:left w:val="single" w:sz="4" w:space="0" w:color="C8BFA8"/>
+              <w:bottom w:val="single" w:sz="4" w:space="0" w:color="C8BFA8"/>
+              <w:right w:val="single" w:sz="4" w:space="0" w:color="C8BFA8"/>
+            </w:tcBorders>
+            <w:tcMar>
+              <w:top w:w="40" w:type="dxa"/>
+              <w:left w:w="80" w:type="dxa"/>
+              <w:bottom w:w="40" w:type="dxa"/>
+              <w:right w:w="80" w:type="dxa"/>
+            </w:tcMar>
+            <w:vAlign w:val="center"/>
+            <w:shd w:fill="F4F1EA" w:val="clear"/>
+          </w:tcPr>
+          <w:p>
+            <w:pPr>
+              <w:spacing w:before="0" w:after="0" w:line="320" w:lineRule="exact"/>
+              <w:jc w:val="center"/>
+            </w:pPr>
+            <w:r/>
+            <w:r>
+              <w:rPr>
+                <w:rFonts w:ascii="微软雅黑" w:hAnsi="微软雅黑" w:eastAsia="微软雅黑"/>
+                <w:b w:val="0"/>
+                <w:i w:val="0"/>
+                <w:color w:val="1A243A"/>
+                <w:sz w:val="18"/>
+              </w:rPr>
+              <w:t>三条</w:t>
+            </w:r>
+          </w:p>
+        </w:tc>
+        <w:tc>
+          <w:tcPr>
+            <w:tcW w:type="dxa" w:w="1361"/>
+            <w:shd w:fill="FFFFFF" w:val="clear"/>
+            <w:tcBorders>
+              <w:top w:val="single" w:sz="4" w:space="0" w:color="C8BFA8"/>
+              <w:left w:val="single" w:sz="4" w:space="0" w:color="C8BFA8"/>
+              <w:bottom w:val="single" w:sz="4" w:space="0" w:color="C8BFA8"/>
+              <w:right w:val="single" w:sz="4" w:space="0" w:color="C8BFA8"/>
+            </w:tcBorders>
+            <w:tcMar>
+              <w:top w:w="40" w:type="dxa"/>
+              <w:left w:w="80" w:type="dxa"/>
+              <w:bottom w:w="40" w:type="dxa"/>
+              <w:right w:w="80" w:type="dxa"/>
+            </w:tcMar>
+            <w:vAlign w:val="center"/>
+            <w:shd w:fill="F4F1EA" w:val="clear"/>
+          </w:tcPr>
+          <w:p>
+            <w:pPr>
+              <w:spacing w:before="0" w:after="0" w:line="320" w:lineRule="exact"/>
+              <w:jc w:val="center"/>
+            </w:pPr>
+            <w:r/>
+            <w:r>
+              <w:rPr>
+                <w:rFonts w:ascii="微软雅黑" w:hAnsi="微软雅黑" w:eastAsia="微软雅黑"/>
+                <w:b w:val="0"/>
+                <w:i w:val="0"/>
+                <w:color w:val="1A243A"/>
+                <w:sz w:val="18"/>
+              </w:rPr>
+              <w:t>4</w:t>
+            </w:r>
+          </w:p>
+        </w:tc>
+        <w:tc>
+          <w:tcPr>
+            <w:tcW w:type="dxa" w:w="5669"/>
+            <w:shd w:fill="FFFFFF" w:val="clear"/>
+            <w:tcBorders>
+              <w:top w:val="single" w:sz="4" w:space="0" w:color="C8BFA8"/>
+              <w:left w:val="single" w:sz="4" w:space="0" w:color="C8BFA8"/>
+              <w:bottom w:val="single" w:sz="4" w:space="0" w:color="C8BFA8"/>
+              <w:right w:val="single" w:sz="4" w:space="0" w:color="C8BFA8"/>
+            </w:tcBorders>
+            <w:tcMar>
+              <w:top w:w="40" w:type="dxa"/>
+              <w:left w:w="80" w:type="dxa"/>
+              <w:bottom w:w="40" w:type="dxa"/>
+              <w:right w:w="80" w:type="dxa"/>
+            </w:tcMar>
+            <w:vAlign w:val="center"/>
+            <w:shd w:fill="F4F1EA" w:val="clear"/>
+          </w:tcPr>
+          <w:p>
+            <w:pPr>
+              <w:spacing w:before="0" w:after="0" w:line="320" w:lineRule="exact"/>
+              <w:jc w:val="left"/>
+            </w:pPr>
+            <w:r/>
+            <w:r>
+              <w:rPr>
+                <w:rFonts w:ascii="微软雅黑" w:hAnsi="微软雅黑" w:eastAsia="微软雅黑"/>
+                <w:b w:val="0"/>
+                <w:i w:val="0"/>
+                <w:color w:val="1A243A"/>
+                <w:sz w:val="18"/>
+              </w:rPr>
+              <w:t>+25</w:t>
+            </w:r>
+          </w:p>
+        </w:tc>
+      </w:tr>
+      <w:tr>
+        <w:trPr>
+          <w:cantSplit/>
+        </w:trPr>
+        <w:tc>
+          <w:tcPr>
+            <w:tcW w:type="dxa" w:w="2268"/>
+            <w:shd w:fill="FFFFFF" w:val="clear"/>
+            <w:tcBorders>
+              <w:top w:val="single" w:sz="4" w:space="0" w:color="C8BFA8"/>
+              <w:left w:val="single" w:sz="4" w:space="0" w:color="C8BFA8"/>
+              <w:bottom w:val="single" w:sz="4" w:space="0" w:color="C8BFA8"/>
+              <w:right w:val="single" w:sz="4" w:space="0" w:color="C8BFA8"/>
+            </w:tcBorders>
+            <w:tcMar>
+              <w:top w:w="40" w:type="dxa"/>
+              <w:left w:w="80" w:type="dxa"/>
+              <w:bottom w:w="40" w:type="dxa"/>
+              <w:right w:w="80" w:type="dxa"/>
+            </w:tcMar>
+            <w:vAlign w:val="center"/>
+          </w:tcPr>
+          <w:p>
+            <w:pPr>
+              <w:spacing w:before="0" w:after="0" w:line="320" w:lineRule="exact"/>
+              <w:jc w:val="center"/>
+            </w:pPr>
+            <w:r/>
+            <w:r>
+              <w:rPr>
+                <w:rFonts w:ascii="微软雅黑" w:hAnsi="微软雅黑" w:eastAsia="微软雅黑"/>
+                <w:b w:val="0"/>
+                <w:i w:val="0"/>
+                <w:color w:val="1A243A"/>
+                <w:sz w:val="18"/>
+              </w:rPr>
+              <w:t>顺子</w:t>
+            </w:r>
+          </w:p>
+        </w:tc>
+        <w:tc>
+          <w:tcPr>
+            <w:tcW w:type="dxa" w:w="1361"/>
+            <w:shd w:fill="FFFFFF" w:val="clear"/>
+            <w:tcBorders>
+              <w:top w:val="single" w:sz="4" w:space="0" w:color="C8BFA8"/>
+              <w:left w:val="single" w:sz="4" w:space="0" w:color="C8BFA8"/>
+              <w:bottom w:val="single" w:sz="4" w:space="0" w:color="C8BFA8"/>
+              <w:right w:val="single" w:sz="4" w:space="0" w:color="C8BFA8"/>
+            </w:tcBorders>
+            <w:tcMar>
+              <w:top w:w="40" w:type="dxa"/>
+              <w:left w:w="80" w:type="dxa"/>
+              <w:bottom w:w="40" w:type="dxa"/>
+              <w:right w:w="80" w:type="dxa"/>
+            </w:tcMar>
+            <w:vAlign w:val="center"/>
+          </w:tcPr>
+          <w:p>
+            <w:pPr>
+              <w:spacing w:before="0" w:after="0" w:line="320" w:lineRule="exact"/>
+              <w:jc w:val="center"/>
+            </w:pPr>
+            <w:r/>
+            <w:r>
+              <w:rPr>
+                <w:rFonts w:ascii="微软雅黑" w:hAnsi="微软雅黑" w:eastAsia="微软雅黑"/>
+                <w:b w:val="0"/>
+                <w:i w:val="0"/>
+                <w:color w:val="1A243A"/>
+                <w:sz w:val="18"/>
+              </w:rPr>
+              <w:t>5</w:t>
+            </w:r>
+          </w:p>
+        </w:tc>
+        <w:tc>
+          <w:tcPr>
+            <w:tcW w:type="dxa" w:w="5669"/>
+            <w:shd w:fill="FFFFFF" w:val="clear"/>
+            <w:tcBorders>
+              <w:top w:val="single" w:sz="4" w:space="0" w:color="C8BFA8"/>
+              <w:left w:val="single" w:sz="4" w:space="0" w:color="C8BFA8"/>
+              <w:bottom w:val="single" w:sz="4" w:space="0" w:color="C8BFA8"/>
+              <w:right w:val="single" w:sz="4" w:space="0" w:color="C8BFA8"/>
+            </w:tcBorders>
+            <w:tcMar>
+              <w:top w:w="40" w:type="dxa"/>
+              <w:left w:w="80" w:type="dxa"/>
+              <w:bottom w:w="40" w:type="dxa"/>
+              <w:right w:w="80" w:type="dxa"/>
+            </w:tcMar>
+            <w:vAlign w:val="center"/>
+          </w:tcPr>
+          <w:p>
+            <w:pPr>
+              <w:spacing w:before="0" w:after="0" w:line="320" w:lineRule="exact"/>
+              <w:jc w:val="left"/>
+            </w:pPr>
+            <w:r/>
+            <w:r>
+              <w:rPr>
+                <w:rFonts w:ascii="微软雅黑" w:hAnsi="微软雅黑" w:eastAsia="微软雅黑"/>
+                <w:b w:val="0"/>
+                <w:i w:val="0"/>
+                <w:color w:val="1A243A"/>
+                <w:sz w:val="18"/>
+              </w:rPr>
+              <w:t>+50</w:t>
+            </w:r>
+          </w:p>
+        </w:tc>
+      </w:tr>
+      <w:tr>
+        <w:trPr>
+          <w:cantSplit/>
+        </w:trPr>
+        <w:tc>
+          <w:tcPr>
+            <w:tcW w:type="dxa" w:w="2268"/>
+            <w:shd w:fill="FFFFFF" w:val="clear"/>
+            <w:tcBorders>
+              <w:top w:val="single" w:sz="4" w:space="0" w:color="C8BFA8"/>
+              <w:left w:val="single" w:sz="4" w:space="0" w:color="C8BFA8"/>
+              <w:bottom w:val="single" w:sz="4" w:space="0" w:color="C8BFA8"/>
+              <w:right w:val="single" w:sz="4" w:space="0" w:color="C8BFA8"/>
+            </w:tcBorders>
+            <w:tcMar>
+              <w:top w:w="40" w:type="dxa"/>
+              <w:left w:w="80" w:type="dxa"/>
+              <w:bottom w:w="40" w:type="dxa"/>
+              <w:right w:w="80" w:type="dxa"/>
+            </w:tcMar>
+            <w:vAlign w:val="center"/>
+            <w:shd w:fill="F4F1EA" w:val="clear"/>
+          </w:tcPr>
+          <w:p>
+            <w:pPr>
+              <w:spacing w:before="0" w:after="0" w:line="320" w:lineRule="exact"/>
+              <w:jc w:val="center"/>
+            </w:pPr>
+            <w:r/>
+            <w:r>
+              <w:rPr>
+                <w:rFonts w:ascii="微软雅黑" w:hAnsi="微软雅黑" w:eastAsia="微软雅黑"/>
+                <w:b w:val="0"/>
+                <w:i w:val="0"/>
+                <w:color w:val="1A243A"/>
+                <w:sz w:val="18"/>
+              </w:rPr>
+              <w:t>同花</w:t>
+            </w:r>
+          </w:p>
+        </w:tc>
+        <w:tc>
+          <w:tcPr>
+            <w:tcW w:type="dxa" w:w="1361"/>
+            <w:shd w:fill="FFFFFF" w:val="clear"/>
+            <w:tcBorders>
+              <w:top w:val="single" w:sz="4" w:space="0" w:color="C8BFA8"/>
+              <w:left w:val="single" w:sz="4" w:space="0" w:color="C8BFA8"/>
+              <w:bottom w:val="single" w:sz="4" w:space="0" w:color="C8BFA8"/>
+              <w:right w:val="single" w:sz="4" w:space="0" w:color="C8BFA8"/>
+            </w:tcBorders>
+            <w:tcMar>
+              <w:top w:w="40" w:type="dxa"/>
+              <w:left w:w="80" w:type="dxa"/>
+              <w:bottom w:w="40" w:type="dxa"/>
+              <w:right w:w="80" w:type="dxa"/>
+            </w:tcMar>
+            <w:vAlign w:val="center"/>
+            <w:shd w:fill="F4F1EA" w:val="clear"/>
+          </w:tcPr>
+          <w:p>
+            <w:pPr>
+              <w:spacing w:before="0" w:after="0" w:line="320" w:lineRule="exact"/>
+              <w:jc w:val="center"/>
+            </w:pPr>
+            <w:r/>
+            <w:r>
+              <w:rPr>
+                <w:rFonts w:ascii="微软雅黑" w:hAnsi="微软雅黑" w:eastAsia="微软雅黑"/>
+                <w:b w:val="0"/>
+                <w:i w:val="0"/>
+                <w:color w:val="1A243A"/>
+                <w:sz w:val="18"/>
+              </w:rPr>
+              <w:t>6</w:t>
+            </w:r>
+          </w:p>
+        </w:tc>
+        <w:tc>
+          <w:tcPr>
+            <w:tcW w:type="dxa" w:w="5669"/>
+            <w:shd w:fill="FFFFFF" w:val="clear"/>
+            <w:tcBorders>
+              <w:top w:val="single" w:sz="4" w:space="0" w:color="C8BFA8"/>
+              <w:left w:val="single" w:sz="4" w:space="0" w:color="C8BFA8"/>
+              <w:bottom w:val="single" w:sz="4" w:space="0" w:color="C8BFA8"/>
+              <w:right w:val="single" w:sz="4" w:space="0" w:color="C8BFA8"/>
+            </w:tcBorders>
+            <w:tcMar>
+              <w:top w:w="40" w:type="dxa"/>
+              <w:left w:w="80" w:type="dxa"/>
+              <w:bottom w:w="40" w:type="dxa"/>
+              <w:right w:w="80" w:type="dxa"/>
+            </w:tcMar>
+            <w:vAlign w:val="center"/>
+            <w:shd w:fill="F4F1EA" w:val="clear"/>
+          </w:tcPr>
+          <w:p>
+            <w:pPr>
+              <w:spacing w:before="0" w:after="0" w:line="320" w:lineRule="exact"/>
+              <w:jc w:val="left"/>
+            </w:pPr>
+            <w:r/>
+            <w:r>
+              <w:rPr>
+                <w:rFonts w:ascii="微软雅黑" w:hAnsi="微软雅黑" w:eastAsia="微软雅黑"/>
+                <w:b w:val="0"/>
+                <w:i w:val="0"/>
+                <w:color w:val="1A243A"/>
+                <w:sz w:val="18"/>
+              </w:rPr>
+              <w:t>+75</w:t>
+            </w:r>
+          </w:p>
+        </w:tc>
+      </w:tr>
+      <w:tr>
+        <w:trPr>
+          <w:cantSplit/>
+        </w:trPr>
+        <w:tc>
+          <w:tcPr>
+            <w:tcW w:type="dxa" w:w="2268"/>
+            <w:shd w:fill="FFFFFF" w:val="clear"/>
+            <w:tcBorders>
+              <w:top w:val="single" w:sz="4" w:space="0" w:color="C8BFA8"/>
+              <w:left w:val="single" w:sz="4" w:space="0" w:color="C8BFA8"/>
+              <w:bottom w:val="single" w:sz="4" w:space="0" w:color="C8BFA8"/>
+              <w:right w:val="single" w:sz="4" w:space="0" w:color="C8BFA8"/>
+            </w:tcBorders>
+            <w:tcMar>
+              <w:top w:w="40" w:type="dxa"/>
+              <w:left w:w="80" w:type="dxa"/>
+              <w:bottom w:w="40" w:type="dxa"/>
+              <w:right w:w="80" w:type="dxa"/>
+            </w:tcMar>
+            <w:vAlign w:val="center"/>
+          </w:tcPr>
+          <w:p>
+            <w:pPr>
+              <w:spacing w:before="0" w:after="0" w:line="320" w:lineRule="exact"/>
+              <w:jc w:val="center"/>
+            </w:pPr>
+            <w:r/>
+            <w:r>
+              <w:rPr>
+                <w:rFonts w:ascii="微软雅黑" w:hAnsi="微软雅黑" w:eastAsia="微软雅黑"/>
+                <w:b w:val="0"/>
+                <w:i w:val="0"/>
+                <w:color w:val="1A243A"/>
+                <w:sz w:val="18"/>
+              </w:rPr>
+              <w:t>葫芦</w:t>
+            </w:r>
+          </w:p>
+        </w:tc>
+        <w:tc>
+          <w:tcPr>
+            <w:tcW w:type="dxa" w:w="1361"/>
+            <w:shd w:fill="FFFFFF" w:val="clear"/>
+            <w:tcBorders>
+              <w:top w:val="single" w:sz="4" w:space="0" w:color="C8BFA8"/>
+              <w:left w:val="single" w:sz="4" w:space="0" w:color="C8BFA8"/>
+              <w:bottom w:val="single" w:sz="4" w:space="0" w:color="C8BFA8"/>
+              <w:right w:val="single" w:sz="4" w:space="0" w:color="C8BFA8"/>
+            </w:tcBorders>
+            <w:tcMar>
+              <w:top w:w="40" w:type="dxa"/>
+              <w:left w:w="80" w:type="dxa"/>
+              <w:bottom w:w="40" w:type="dxa"/>
+              <w:right w:w="80" w:type="dxa"/>
+            </w:tcMar>
+            <w:vAlign w:val="center"/>
+          </w:tcPr>
+          <w:p>
+            <w:pPr>
+              <w:spacing w:before="0" w:after="0" w:line="320" w:lineRule="exact"/>
+              <w:jc w:val="center"/>
+            </w:pPr>
+            <w:r/>
+            <w:r>
+              <w:rPr>
+                <w:rFonts w:ascii="微软雅黑" w:hAnsi="微软雅黑" w:eastAsia="微软雅黑"/>
+                <w:b w:val="0"/>
+                <w:i w:val="0"/>
+                <w:color w:val="1A243A"/>
+                <w:sz w:val="18"/>
+              </w:rPr>
+              <w:t>7</w:t>
+            </w:r>
+          </w:p>
+        </w:tc>
+        <w:tc>
+          <w:tcPr>
+            <w:tcW w:type="dxa" w:w="5669"/>
+            <w:shd w:fill="FFFFFF" w:val="clear"/>
+            <w:tcBorders>
+              <w:top w:val="single" w:sz="4" w:space="0" w:color="C8BFA8"/>
+              <w:left w:val="single" w:sz="4" w:space="0" w:color="C8BFA8"/>
+              <w:bottom w:val="single" w:sz="4" w:space="0" w:color="C8BFA8"/>
+              <w:right w:val="single" w:sz="4" w:space="0" w:color="C8BFA8"/>
+            </w:tcBorders>
+            <w:tcMar>
+              <w:top w:w="40" w:type="dxa"/>
+              <w:left w:w="80" w:type="dxa"/>
+              <w:bottom w:w="40" w:type="dxa"/>
+              <w:right w:w="80" w:type="dxa"/>
+            </w:tcMar>
+            <w:vAlign w:val="center"/>
+          </w:tcPr>
+          <w:p>
+            <w:pPr>
+              <w:spacing w:before="0" w:after="0" w:line="320" w:lineRule="exact"/>
+              <w:jc w:val="left"/>
+            </w:pPr>
+            <w:r/>
+            <w:r>
+              <w:rPr>
+                <w:rFonts w:ascii="微软雅黑" w:hAnsi="微软雅黑" w:eastAsia="微软雅黑"/>
+                <w:b w:val="0"/>
+                <w:i w:val="0"/>
+                <w:color w:val="1A243A"/>
+                <w:sz w:val="18"/>
+              </w:rPr>
+              <w:t>+100</w:t>
+            </w:r>
+          </w:p>
+        </w:tc>
+      </w:tr>
+      <w:tr>
+        <w:trPr>
+          <w:cantSplit/>
+        </w:trPr>
+        <w:tc>
+          <w:tcPr>
+            <w:tcW w:type="dxa" w:w="2268"/>
+            <w:shd w:fill="FFFFFF" w:val="clear"/>
+            <w:tcBorders>
+              <w:top w:val="single" w:sz="4" w:space="0" w:color="C8BFA8"/>
+              <w:left w:val="single" w:sz="4" w:space="0" w:color="C8BFA8"/>
+              <w:bottom w:val="single" w:sz="4" w:space="0" w:color="C8BFA8"/>
+              <w:right w:val="single" w:sz="4" w:space="0" w:color="C8BFA8"/>
+            </w:tcBorders>
+            <w:tcMar>
+              <w:top w:w="40" w:type="dxa"/>
+              <w:left w:w="80" w:type="dxa"/>
+              <w:bottom w:w="40" w:type="dxa"/>
+              <w:right w:w="80" w:type="dxa"/>
+            </w:tcMar>
+            <w:vAlign w:val="center"/>
+            <w:shd w:fill="F4F1EA" w:val="clear"/>
+          </w:tcPr>
+          <w:p>
+            <w:pPr>
+              <w:spacing w:before="0" w:after="0" w:line="320" w:lineRule="exact"/>
+              <w:jc w:val="center"/>
+            </w:pPr>
+            <w:r/>
+            <w:r>
+              <w:rPr>
+                <w:rFonts w:ascii="微软雅黑" w:hAnsi="微软雅黑" w:eastAsia="微软雅黑"/>
+                <w:b w:val="0"/>
+                <w:i w:val="0"/>
+                <w:color w:val="1A243A"/>
+                <w:sz w:val="18"/>
+              </w:rPr>
+              <w:t>四条</w:t>
+            </w:r>
+          </w:p>
+        </w:tc>
+        <w:tc>
+          <w:tcPr>
+            <w:tcW w:type="dxa" w:w="1361"/>
+            <w:shd w:fill="FFFFFF" w:val="clear"/>
+            <w:tcBorders>
+              <w:top w:val="single" w:sz="4" w:space="0" w:color="C8BFA8"/>
+              <w:left w:val="single" w:sz="4" w:space="0" w:color="C8BFA8"/>
+              <w:bottom w:val="single" w:sz="4" w:space="0" w:color="C8BFA8"/>
+              <w:right w:val="single" w:sz="4" w:space="0" w:color="C8BFA8"/>
+            </w:tcBorders>
+            <w:tcMar>
+              <w:top w:w="40" w:type="dxa"/>
+              <w:left w:w="80" w:type="dxa"/>
+              <w:bottom w:w="40" w:type="dxa"/>
+              <w:right w:w="80" w:type="dxa"/>
+            </w:tcMar>
+            <w:vAlign w:val="center"/>
+            <w:shd w:fill="F4F1EA" w:val="clear"/>
+          </w:tcPr>
+          <w:p>
+            <w:pPr>
+              <w:spacing w:before="0" w:after="0" w:line="320" w:lineRule="exact"/>
+              <w:jc w:val="center"/>
+            </w:pPr>
+            <w:r/>
+            <w:r>
+              <w:rPr>
+                <w:rFonts w:ascii="微软雅黑" w:hAnsi="微软雅黑" w:eastAsia="微软雅黑"/>
+                <w:b w:val="0"/>
+                <w:i w:val="0"/>
+                <w:color w:val="1A243A"/>
+                <w:sz w:val="18"/>
+              </w:rPr>
+              <w:t>8</w:t>
+            </w:r>
+          </w:p>
+        </w:tc>
+        <w:tc>
+          <w:tcPr>
+            <w:tcW w:type="dxa" w:w="5669"/>
+            <w:shd w:fill="FFFFFF" w:val="clear"/>
+            <w:tcBorders>
+              <w:top w:val="single" w:sz="4" w:space="0" w:color="C8BFA8"/>
+              <w:left w:val="single" w:sz="4" w:space="0" w:color="C8BFA8"/>
+              <w:bottom w:val="single" w:sz="4" w:space="0" w:color="C8BFA8"/>
+              <w:right w:val="single" w:sz="4" w:space="0" w:color="C8BFA8"/>
+            </w:tcBorders>
+            <w:tcMar>
+              <w:top w:w="40" w:type="dxa"/>
+              <w:left w:w="80" w:type="dxa"/>
+              <w:bottom w:w="40" w:type="dxa"/>
+              <w:right w:w="80" w:type="dxa"/>
+            </w:tcMar>
+            <w:vAlign w:val="center"/>
+            <w:shd w:fill="F4F1EA" w:val="clear"/>
+          </w:tcPr>
+          <w:p>
+            <w:pPr>
+              <w:spacing w:before="0" w:after="0" w:line="320" w:lineRule="exact"/>
+              <w:jc w:val="left"/>
+            </w:pPr>
+            <w:r/>
+            <w:r>
+              <w:rPr>
+                <w:rFonts w:ascii="微软雅黑" w:hAnsi="微软雅黑" w:eastAsia="微软雅黑"/>
+                <w:b w:val="0"/>
+                <w:i w:val="0"/>
+                <w:color w:val="1A243A"/>
+                <w:sz w:val="18"/>
+              </w:rPr>
+              <w:t>+250</w:t>
+            </w:r>
+          </w:p>
+        </w:tc>
+      </w:tr>
+      <w:tr>
+        <w:trPr>
+          <w:cantSplit/>
+        </w:trPr>
+        <w:tc>
+          <w:tcPr>
+            <w:tcW w:type="dxa" w:w="2268"/>
+            <w:shd w:fill="FFFFFF" w:val="clear"/>
+            <w:tcBorders>
+              <w:top w:val="single" w:sz="4" w:space="0" w:color="C8BFA8"/>
+              <w:left w:val="single" w:sz="4" w:space="0" w:color="C8BFA8"/>
+              <w:bottom w:val="single" w:sz="4" w:space="0" w:color="C8BFA8"/>
+              <w:right w:val="single" w:sz="4" w:space="0" w:color="C8BFA8"/>
+            </w:tcBorders>
+            <w:tcMar>
+              <w:top w:w="40" w:type="dxa"/>
+              <w:left w:w="80" w:type="dxa"/>
+              <w:bottom w:w="40" w:type="dxa"/>
+              <w:right w:w="80" w:type="dxa"/>
+            </w:tcMar>
+            <w:vAlign w:val="center"/>
+          </w:tcPr>
+          <w:p>
+            <w:pPr>
+              <w:spacing w:before="0" w:after="0" w:line="320" w:lineRule="exact"/>
+              <w:jc w:val="center"/>
+            </w:pPr>
+            <w:r/>
+            <w:r>
+              <w:rPr>
+                <w:rFonts w:ascii="微软雅黑" w:hAnsi="微软雅黑" w:eastAsia="微软雅黑"/>
+                <w:b w:val="0"/>
+                <w:i w:val="0"/>
+                <w:color w:val="1A243A"/>
+                <w:sz w:val="18"/>
+              </w:rPr>
+              <w:t>同花顺</w:t>
+            </w:r>
+          </w:p>
+        </w:tc>
+        <w:tc>
+          <w:tcPr>
+            <w:tcW w:type="dxa" w:w="1361"/>
+            <w:shd w:fill="FFFFFF" w:val="clear"/>
+            <w:tcBorders>
+              <w:top w:val="single" w:sz="4" w:space="0" w:color="C8BFA8"/>
+              <w:left w:val="single" w:sz="4" w:space="0" w:color="C8BFA8"/>
+              <w:bottom w:val="single" w:sz="4" w:space="0" w:color="C8BFA8"/>
+              <w:right w:val="single" w:sz="4" w:space="0" w:color="C8BFA8"/>
+            </w:tcBorders>
+            <w:tcMar>
+              <w:top w:w="40" w:type="dxa"/>
+              <w:left w:w="80" w:type="dxa"/>
+              <w:bottom w:w="40" w:type="dxa"/>
+              <w:right w:w="80" w:type="dxa"/>
+            </w:tcMar>
+            <w:vAlign w:val="center"/>
+          </w:tcPr>
+          <w:p>
+            <w:pPr>
+              <w:spacing w:before="0" w:after="0" w:line="320" w:lineRule="exact"/>
+              <w:jc w:val="center"/>
+            </w:pPr>
+            <w:r/>
+            <w:r>
+              <w:rPr>
+                <w:rFonts w:ascii="微软雅黑" w:hAnsi="微软雅黑" w:eastAsia="微软雅黑"/>
+                <w:b w:val="0"/>
+                <w:i w:val="0"/>
+                <w:color w:val="1A243A"/>
+                <w:sz w:val="18"/>
+              </w:rPr>
+              <w:t>9</w:t>
+            </w:r>
+          </w:p>
+        </w:tc>
+        <w:tc>
+          <w:tcPr>
+            <w:tcW w:type="dxa" w:w="5669"/>
+            <w:shd w:fill="FFFFFF" w:val="clear"/>
+            <w:tcBorders>
+              <w:top w:val="single" w:sz="4" w:space="0" w:color="C8BFA8"/>
+              <w:left w:val="single" w:sz="4" w:space="0" w:color="C8BFA8"/>
+              <w:bottom w:val="single" w:sz="4" w:space="0" w:color="C8BFA8"/>
+              <w:right w:val="single" w:sz="4" w:space="0" w:color="C8BFA8"/>
+            </w:tcBorders>
+            <w:tcMar>
+              <w:top w:w="40" w:type="dxa"/>
+              <w:left w:w="80" w:type="dxa"/>
+              <w:bottom w:w="40" w:type="dxa"/>
+              <w:right w:w="80" w:type="dxa"/>
+            </w:tcMar>
+            <w:vAlign w:val="center"/>
+          </w:tcPr>
+          <w:p>
+            <w:pPr>
+              <w:spacing w:before="0" w:after="0" w:line="320" w:lineRule="exact"/>
+              <w:jc w:val="left"/>
+            </w:pPr>
+            <w:r/>
+            <w:r>
+              <w:rPr>
+                <w:rFonts w:ascii="微软雅黑" w:hAnsi="微软雅黑" w:eastAsia="微软雅黑"/>
+                <w:b w:val="0"/>
+                <w:i w:val="0"/>
+                <w:color w:val="1A243A"/>
+                <w:sz w:val="18"/>
+              </w:rPr>
+              <w:t>+400</w:t>
+            </w:r>
+          </w:p>
+        </w:tc>
+      </w:tr>
+      <w:tr>
+        <w:trPr>
+          <w:cantSplit/>
+        </w:trPr>
+        <w:tc>
+          <w:tcPr>
+            <w:tcW w:type="dxa" w:w="2268"/>
+            <w:shd w:fill="FFFFFF" w:val="clear"/>
+            <w:tcBorders>
+              <w:top w:val="single" w:sz="4" w:space="0" w:color="C8BFA8"/>
+              <w:left w:val="single" w:sz="4" w:space="0" w:color="C8BFA8"/>
+              <w:bottom w:val="single" w:sz="4" w:space="0" w:color="C8BFA8"/>
+              <w:right w:val="single" w:sz="4" w:space="0" w:color="C8BFA8"/>
+            </w:tcBorders>
+            <w:tcMar>
+              <w:top w:w="40" w:type="dxa"/>
+              <w:left w:w="80" w:type="dxa"/>
+              <w:bottom w:w="40" w:type="dxa"/>
+              <w:right w:w="80" w:type="dxa"/>
+            </w:tcMar>
+            <w:vAlign w:val="center"/>
+            <w:shd w:fill="F4F1EA" w:val="clear"/>
+          </w:tcPr>
+          <w:p>
+            <w:pPr>
+              <w:spacing w:before="0" w:after="0" w:line="320" w:lineRule="exact"/>
+              <w:jc w:val="center"/>
+            </w:pPr>
+            <w:r/>
+            <w:r>
+              <w:rPr>
+                <w:rFonts w:ascii="微软雅黑" w:hAnsi="微软雅黑" w:eastAsia="微软雅黑"/>
+                <w:b w:val="0"/>
+                <w:i w:val="0"/>
+                <w:color w:val="1A243A"/>
+                <w:sz w:val="18"/>
+              </w:rPr>
+              <w:t>皇家同花顺</w:t>
+            </w:r>
+          </w:p>
+        </w:tc>
+        <w:tc>
+          <w:tcPr>
+            <w:tcW w:type="dxa" w:w="1361"/>
+            <w:shd w:fill="FFFFFF" w:val="clear"/>
+            <w:tcBorders>
+              <w:top w:val="single" w:sz="4" w:space="0" w:color="C8BFA8"/>
+              <w:left w:val="single" w:sz="4" w:space="0" w:color="C8BFA8"/>
+              <w:bottom w:val="single" w:sz="4" w:space="0" w:color="C8BFA8"/>
+              <w:right w:val="single" w:sz="4" w:space="0" w:color="C8BFA8"/>
+            </w:tcBorders>
+            <w:tcMar>
+              <w:top w:w="40" w:type="dxa"/>
+              <w:left w:w="80" w:type="dxa"/>
+              <w:bottom w:w="40" w:type="dxa"/>
+              <w:right w:w="80" w:type="dxa"/>
+            </w:tcMar>
+            <w:vAlign w:val="center"/>
+            <w:shd w:fill="F4F1EA" w:val="clear"/>
+          </w:tcPr>
+          <w:p>
+            <w:pPr>
+              <w:spacing w:before="0" w:after="0" w:line="320" w:lineRule="exact"/>
+              <w:jc w:val="center"/>
+            </w:pPr>
+            <w:r/>
+            <w:r>
+              <w:rPr>
+                <w:rFonts w:ascii="微软雅黑" w:hAnsi="微软雅黑" w:eastAsia="微软雅黑"/>
+                <w:b w:val="0"/>
+                <w:i w:val="0"/>
+                <w:color w:val="1A243A"/>
+                <w:sz w:val="18"/>
+              </w:rPr>
+              <w:t>10</w:t>
+            </w:r>
+          </w:p>
+        </w:tc>
+        <w:tc>
+          <w:tcPr>
+            <w:tcW w:type="dxa" w:w="5669"/>
+            <w:shd w:fill="FFFFFF" w:val="clear"/>
+            <w:tcBorders>
+              <w:top w:val="single" w:sz="4" w:space="0" w:color="C8BFA8"/>
+              <w:left w:val="single" w:sz="4" w:space="0" w:color="C8BFA8"/>
+              <w:bottom w:val="single" w:sz="4" w:space="0" w:color="C8BFA8"/>
+              <w:right w:val="single" w:sz="4" w:space="0" w:color="C8BFA8"/>
+            </w:tcBorders>
+            <w:tcMar>
+              <w:top w:w="40" w:type="dxa"/>
+              <w:left w:w="80" w:type="dxa"/>
+              <w:bottom w:w="40" w:type="dxa"/>
+              <w:right w:w="80" w:type="dxa"/>
+            </w:tcMar>
+            <w:vAlign w:val="center"/>
+            <w:shd w:fill="F4F1EA" w:val="clear"/>
+          </w:tcPr>
+          <w:p>
+            <w:pPr>
+              <w:spacing w:before="0" w:after="0" w:line="320" w:lineRule="exact"/>
+              <w:jc w:val="left"/>
+            </w:pPr>
+            <w:r/>
+            <w:r>
+              <w:rPr>
+                <w:rFonts w:ascii="微软雅黑" w:hAnsi="微软雅黑" w:eastAsia="微软雅黑"/>
+                <w:b w:val="0"/>
+                <w:i w:val="0"/>
+                <w:color w:val="1A243A"/>
+                <w:sz w:val="18"/>
+              </w:rPr>
+              <w:t>+500</w:t>
+            </w:r>
+          </w:p>
+        </w:tc>
+      </w:tr>
+    </w:tbl>
+    <w:p>
+      <w:pPr>
+        <w:spacing w:before="0" w:after="160" w:line="120" w:lineRule="exact"/>
+      </w:pPr>
+    </w:p>
+    <w:p>
+      <w:pPr>
+        <w:spacing w:before="20" w:after="40" w:line="340" w:lineRule="exact"/>
+        <w:ind w:left="425" w:hanging="255"/>
+      </w:pPr>
+      <w:r>
+        <w:rPr>
+          <w:rFonts w:ascii="微软雅黑" w:hAnsi="微软雅黑" w:eastAsia="微软雅黑"/>
+          <w:b w:val="0"/>
+          <w:i w:val="0"/>
+          <w:color w:val="1A243A"/>
+          <w:sz w:val="21"/>
+        </w:rPr>
+        <w:t>• Fold / Retreat / 平局：不发牌型奖励。</w:t>
+      </w:r>
+    </w:p>
+    <w:p>
+      <w:pPr>
+        <w:spacing w:before="20" w:after="40" w:line="340" w:lineRule="exact"/>
+        <w:ind w:left="425" w:hanging="255"/>
+      </w:pPr>
+      <w:r>
+        <w:rPr>
+          <w:rFonts w:ascii="微软雅黑" w:hAnsi="微软雅黑" w:eastAsia="微软雅黑"/>
+          <w:b w:val="0"/>
+          <w:i w:val="0"/>
+          <w:color w:val="1A243A"/>
+          <w:sz w:val="21"/>
+        </w:rPr>
+        <w:t>• 皇家同花顺是正式独立牌型（category 10）。协议 P09 同时覆盖 category 9 和 10，不另设皇家同花顺独立协议。</w:t>
+      </w:r>
+    </w:p>
+    <w:p>
+      <w:pPr>
+        <w:spacing w:before="20" w:after="40" w:line="340" w:lineRule="exact"/>
+        <w:ind w:left="425" w:hanging="255"/>
+      </w:pPr>
+      <w:r>
+        <w:rPr>
+          <w:rFonts w:ascii="微软雅黑" w:hAnsi="微软雅黑" w:eastAsia="微软雅黑"/>
+          <w:b w:val="0"/>
+          <w:i w:val="0"/>
+          <w:color w:val="1A243A"/>
+          <w:sz w:val="21"/>
+        </w:rPr>
+        <w:t>• 牌型奖励不是「自己的技能倍率」，因此不阻止 Protocol。Blood / Desperation / Dead End 等已有自己的技能倍率时，仍按现有规则阻止自己的 Protocol。</w:t>
+      </w:r>
+    </w:p>
+    <w:tbl>
+      <w:tblPr>
+        <w:tblW w:type="auto" w:w="0"/>
+        <w:jc w:val="center"/>
+        <w:tblLook w:firstColumn="1" w:firstRow="1" w:lastColumn="0" w:lastRow="0" w:noHBand="0" w:noVBand="1" w:val="04A0"/>
+      </w:tblPr>
+      <w:tblGrid>
+        <w:gridCol w:w="9412"/>
+      </w:tblGrid>
+      <w:tr>
+        <w:tc>
+          <w:tcPr>
+            <w:tcW w:type="dxa" w:w="9412"/>
+            <w:shd w:fill="F7F1E3" w:val="clear"/>
+            <w:tcBorders>
+              <w:top w:val="single" w:sz="4" w:space="0" w:color="8A6A2F"/>
+              <w:left w:val="single" w:sz="4" w:space="0" w:color="8A6A2F"/>
+              <w:bottom w:val="single" w:sz="4" w:space="0" w:color="8A6A2F"/>
+              <w:right w:val="single" w:sz="4" w:space="0" w:color="8A6A2F"/>
+            </w:tcBorders>
+            <w:tcMar>
+              <w:top w:w="80" w:type="dxa"/>
+              <w:left w:w="140" w:type="dxa"/>
+              <w:bottom w:w="80" w:type="dxa"/>
+              <w:right w:w="140" w:type="dxa"/>
+            </w:tcMar>
+          </w:tcPr>
+          <w:p>
+            <w:pPr>
+              <w:spacing w:before="0" w:after="0" w:line="360" w:lineRule="exact"/>
+            </w:pPr>
+            <w:r/>
+            <w:r>
+              <w:rPr>
+                <w:rFonts w:ascii="微软雅黑" w:hAnsi="微软雅黑" w:eastAsia="微软雅黑"/>
+                <w:b/>
+                <w:i w:val="0"/>
+                <w:color w:val="8A6A2F"/>
+                <w:sz w:val="21"/>
+              </w:rPr>
+              <w:t>正式结算顺序：standardPokerNet + handRankBonus + 其他基础加值（例如 Probe）→ 自身合法技能倍率 → 对手产生的合法倍率 → Defense → Stack Cap → 唯一整数筹码转移</w:t>
+            </w:r>
+          </w:p>
+        </w:tc>
+      </w:tr>
+    </w:tbl>
+    <w:p>
+      <w:pPr>
+        <w:spacing w:before="0" w:after="160" w:line="120" w:lineRule="exact"/>
+      </w:pPr>
     </w:p>
     <w:p>
       <w:pPr>
@@ -2615,6 +4023,83 @@
           </w:p>
         </w:tc>
       </w:tr>
+      <w:tr>
+        <w:trPr>
+          <w:cantSplit/>
+        </w:trPr>
+        <w:tc>
+          <w:tcPr>
+            <w:tcW w:type="dxa" w:w="2721"/>
+            <w:shd w:fill="FFFFFF" w:val="clear"/>
+            <w:tcBorders>
+              <w:top w:val="single" w:sz="4" w:space="0" w:color="C8BFA8"/>
+              <w:left w:val="single" w:sz="4" w:space="0" w:color="C8BFA8"/>
+              <w:bottom w:val="single" w:sz="4" w:space="0" w:color="C8BFA8"/>
+              <w:right w:val="single" w:sz="4" w:space="0" w:color="C8BFA8"/>
+            </w:tcBorders>
+            <w:tcMar>
+              <w:top w:w="40" w:type="dxa"/>
+              <w:left w:w="80" w:type="dxa"/>
+              <w:bottom w:w="40" w:type="dxa"/>
+              <w:right w:w="80" w:type="dxa"/>
+            </w:tcMar>
+            <w:vAlign w:val="center"/>
+          </w:tcPr>
+          <w:p>
+            <w:pPr>
+              <w:spacing w:before="0" w:after="0" w:line="320" w:lineRule="exact"/>
+              <w:jc w:val="center"/>
+            </w:pPr>
+            <w:r/>
+            <w:r>
+              <w:rPr>
+                <w:rFonts w:ascii="微软雅黑" w:hAnsi="微软雅黑" w:eastAsia="微软雅黑"/>
+                <w:b w:val="0"/>
+                <w:i w:val="0"/>
+                <w:color w:val="1A243A"/>
+                <w:sz w:val="18"/>
+              </w:rPr>
+              <w:t>普通公开快照</w:t>
+            </w:r>
+          </w:p>
+        </w:tc>
+        <w:tc>
+          <w:tcPr>
+            <w:tcW w:type="dxa" w:w="6576"/>
+            <w:shd w:fill="FFFFFF" w:val="clear"/>
+            <w:tcBorders>
+              <w:top w:val="single" w:sz="4" w:space="0" w:color="C8BFA8"/>
+              <w:left w:val="single" w:sz="4" w:space="0" w:color="C8BFA8"/>
+              <w:bottom w:val="single" w:sz="4" w:space="0" w:color="C8BFA8"/>
+              <w:right w:val="single" w:sz="4" w:space="0" w:color="C8BFA8"/>
+            </w:tcBorders>
+            <w:tcMar>
+              <w:top w:w="40" w:type="dxa"/>
+              <w:left w:w="80" w:type="dxa"/>
+              <w:bottom w:w="40" w:type="dxa"/>
+              <w:right w:w="80" w:type="dxa"/>
+            </w:tcMar>
+            <w:vAlign w:val="center"/>
+          </w:tcPr>
+          <w:p>
+            <w:pPr>
+              <w:spacing w:before="0" w:after="0" w:line="320" w:lineRule="exact"/>
+              <w:jc w:val="left"/>
+            </w:pPr>
+            <w:r/>
+            <w:r>
+              <w:rPr>
+                <w:rFonts w:ascii="微软雅黑" w:hAnsi="微软雅黑" w:eastAsia="微软雅黑"/>
+                <w:b w:val="0"/>
+                <w:i w:val="0"/>
+                <w:color w:val="1A243A"/>
+                <w:sz w:val="18"/>
+              </w:rPr>
+              <w:t>clamp(realFinalEnergy, 0, 8)</w:t>
+            </w:r>
+          </w:p>
+        </w:tc>
+      </w:tr>
     </w:tbl>
     <w:p>
       <w:pPr>
@@ -3058,6 +4543,118 @@
           <w:sz w:val="21"/>
         </w:rPr>
         <w:t>公平成功后，本手全部结束恢复都被抑制，包括败者 +1、深呼吸、绝境 +1、反制空放返还、资源型强运。</w:t>
+      </w:r>
+    </w:p>
+    <w:p>
+      <w:pPr>
+        <w:spacing w:before="0" w:after="80" w:line="360" w:lineRule="exact"/>
+        <w:ind w:firstLine="0"/>
+      </w:pPr>
+      <w:r>
+        <w:rPr>
+          <w:rFonts w:ascii="微软雅黑" w:hAnsi="微软雅黑" w:eastAsia="微软雅黑"/>
+          <w:b/>
+          <w:i w:val="0"/>
+          <w:color w:val="1A243A"/>
+          <w:sz w:val="21"/>
+        </w:rPr>
+        <w:t>对手能量规则：逐手公开、手内冻结。</w:t>
+      </w:r>
+    </w:p>
+    <w:p>
+      <w:pPr>
+        <w:spacing w:before="20" w:after="40" w:line="340" w:lineRule="exact"/>
+        <w:ind w:left="425" w:hanging="255"/>
+      </w:pPr>
+      <w:r>
+        <w:rPr>
+          <w:rFonts w:ascii="微软雅黑" w:hAnsi="微软雅黑" w:eastAsia="微软雅黑"/>
+          <w:b w:val="0"/>
+          <w:i w:val="0"/>
+          <w:color w:val="1A243A"/>
+          <w:sz w:val="21"/>
+        </w:rPr>
+        <w:t>• 每手结束：所有能量恢复、Loan 还款、债务、Fairness 抑制、Fortune 资源效果等全部处理结束后，才刷新公开快照。</w:t>
+      </w:r>
+    </w:p>
+    <w:p>
+      <w:pPr>
+        <w:spacing w:before="20" w:after="40" w:line="340" w:lineRule="exact"/>
+        <w:ind w:left="425" w:hanging="255"/>
+      </w:pPr>
+      <w:r>
+        <w:rPr>
+          <w:rFonts w:ascii="微软雅黑" w:hAnsi="微软雅黑" w:eastAsia="微软雅黑"/>
+          <w:b w:val="0"/>
+          <w:i w:val="0"/>
+          <w:color w:val="1A243A"/>
+          <w:sz w:val="21"/>
+        </w:rPr>
+        <w:t>• 下一手进行过程中：对手显示保持冻结，不实时变化。</w:t>
+      </w:r>
+    </w:p>
+    <w:p>
+      <w:pPr>
+        <w:spacing w:before="20" w:after="40" w:line="340" w:lineRule="exact"/>
+        <w:ind w:left="425" w:hanging="255"/>
+      </w:pPr>
+      <w:r>
+        <w:rPr>
+          <w:rFonts w:ascii="微软雅黑" w:hAnsi="微软雅黑" w:eastAsia="微软雅黑"/>
+          <w:b w:val="0"/>
+          <w:i w:val="0"/>
+          <w:color w:val="1A243A"/>
+          <w:sz w:val="21"/>
+        </w:rPr>
+        <w:t>• 普通对手可见值：真实 -4/-3/-1/0 → 0；真实 1~8 → 真实值；真实 9/10 → 8。</w:t>
+      </w:r>
+    </w:p>
+    <w:p>
+      <w:pPr>
+        <w:spacing w:before="20" w:after="40" w:line="340" w:lineRule="exact"/>
+        <w:ind w:left="425" w:hanging="255"/>
+      </w:pPr>
+      <w:r>
+        <w:rPr>
+          <w:rFonts w:ascii="微软雅黑" w:hAnsi="微软雅黑" w:eastAsia="微软雅黑"/>
+          <w:b w:val="0"/>
+          <w:i w:val="0"/>
+          <w:color w:val="1A243A"/>
+          <w:sz w:val="21"/>
+        </w:rPr>
+        <w:t>• 本人始终看到自己的真实当前能量，包括 Strong Fortune 负数和 Destiny 的 9/10。</w:t>
+      </w:r>
+    </w:p>
+    <w:p>
+      <w:pPr>
+        <w:spacing w:before="20" w:after="40" w:line="340" w:lineRule="exact"/>
+        <w:ind w:left="425" w:hanging="255"/>
+      </w:pPr>
+      <w:r>
+        <w:rPr>
+          <w:rFonts w:ascii="微软雅黑" w:hAnsi="微软雅黑" w:eastAsia="微软雅黑"/>
+          <w:b w:val="0"/>
+          <w:i w:val="0"/>
+          <w:color w:val="1A243A"/>
+          <w:sz w:val="21"/>
+        </w:rPr>
+        <w:t>• 灵视始终读取服务器真实当前能量（含负数、9/10 与手内实时变化），只写入私有结果，不得顶替对手信息条上的公开冻结值。</w:t>
+      </w:r>
+    </w:p>
+    <w:p>
+      <w:pPr>
+        <w:spacing w:before="20" w:after="40" w:line="340" w:lineRule="exact"/>
+        <w:ind w:left="425" w:hanging="255"/>
+      </w:pPr>
+      <w:r>
+        <w:rPr>
+          <w:rFonts w:ascii="微软雅黑" w:hAnsi="微软雅黑" w:eastAsia="微软雅黑"/>
+          <w:b w:val="0"/>
+          <w:i w:val="0"/>
+          <w:color w:val="1A243A"/>
+          <w:sz w:val="21"/>
+        </w:rPr>
+        <w:t>• 普通客户端不得通过任何其他字段区分真实 0 与被遮蔽的负数 0，也不得区分真实 8 与 Destiny 被封顶后的 8。</w:t>
       </w:r>
     </w:p>
     <w:p>
@@ -12041,7 +13638,7 @@
           <w:color w:val="1A243A"/>
           <w:sz w:val="21"/>
         </w:rPr>
-        <w:t>• 正常信用同一手：筹码贷最多 2 次，能量贷最多 1 次，合计最多 3 次。</w:t>
+        <w:t>• 两种贷款可以同时存在。</w:t>
       </w:r>
     </w:p>
     <w:p>
@@ -12057,8 +13654,628 @@
           <w:color w:val="1A243A"/>
           <w:sz w:val="21"/>
         </w:rPr>
-        <w:t>• 信用受限时，同一手所有贷款模式合计最多只能发动 1 次，不能再 Energy+Chip 或 Chip+Chip。</w:t>
+        <w:t>• 信用状态三档，额度来自当前信用，不跨 Match。</w:t>
       </w:r>
+    </w:p>
+    <w:tbl>
+      <w:tblPr>
+        <w:tblW w:type="auto" w:w="0"/>
+        <w:jc w:val="center"/>
+        <w:tblLayout w:type="fixed"/>
+        <w:tblLook w:firstColumn="1" w:firstRow="1" w:lastColumn="0" w:lastRow="0" w:noHBand="0" w:noVBand="1" w:val="04A0"/>
+        <w:tblW w:w="0" w:type="auto"/>
+      </w:tblPr>
+      <w:tblGrid>
+        <w:gridCol w:w="2353"/>
+        <w:gridCol w:w="2353"/>
+        <w:gridCol w:w="2353"/>
+        <w:gridCol w:w="2353"/>
+      </w:tblGrid>
+      <w:tr>
+        <w:trPr>
+          <w:cantSplit/>
+        </w:trPr>
+        <w:tc>
+          <w:tcPr>
+            <w:tcW w:type="dxa" w:w="2721"/>
+            <w:shd w:fill="1A243A" w:val="clear"/>
+            <w:tcBorders>
+              <w:top w:val="single" w:sz="4" w:space="0" w:color="C8BFA8"/>
+              <w:left w:val="single" w:sz="4" w:space="0" w:color="C8BFA8"/>
+              <w:bottom w:val="single" w:sz="4" w:space="0" w:color="C8BFA8"/>
+              <w:right w:val="single" w:sz="4" w:space="0" w:color="C8BFA8"/>
+            </w:tcBorders>
+            <w:tcMar>
+              <w:top w:w="40" w:type="dxa"/>
+              <w:left w:w="80" w:type="dxa"/>
+              <w:bottom w:w="40" w:type="dxa"/>
+              <w:right w:w="80" w:type="dxa"/>
+            </w:tcMar>
+            <w:vAlign w:val="center"/>
+          </w:tcPr>
+          <w:p>
+            <w:pPr>
+              <w:spacing w:before="0" w:after="0" w:line="320" w:lineRule="exact"/>
+              <w:jc w:val="center"/>
+            </w:pPr>
+            <w:r/>
+            <w:r>
+              <w:rPr>
+                <w:rFonts w:ascii="微软雅黑" w:hAnsi="微软雅黑" w:eastAsia="微软雅黑"/>
+                <w:b/>
+                <w:i w:val="0"/>
+                <w:color w:val="FFFFFF"/>
+                <w:sz w:val="18"/>
+              </w:rPr>
+              <w:t>信用</w:t>
+            </w:r>
+          </w:p>
+        </w:tc>
+        <w:tc>
+          <w:tcPr>
+            <w:tcW w:type="dxa" w:w="1587"/>
+            <w:shd w:fill="1A243A" w:val="clear"/>
+            <w:tcBorders>
+              <w:top w:val="single" w:sz="4" w:space="0" w:color="C8BFA8"/>
+              <w:left w:val="single" w:sz="4" w:space="0" w:color="C8BFA8"/>
+              <w:bottom w:val="single" w:sz="4" w:space="0" w:color="C8BFA8"/>
+              <w:right w:val="single" w:sz="4" w:space="0" w:color="C8BFA8"/>
+            </w:tcBorders>
+            <w:tcMar>
+              <w:top w:w="40" w:type="dxa"/>
+              <w:left w:w="80" w:type="dxa"/>
+              <w:bottom w:w="40" w:type="dxa"/>
+              <w:right w:w="80" w:type="dxa"/>
+            </w:tcMar>
+            <w:vAlign w:val="center"/>
+          </w:tcPr>
+          <w:p>
+            <w:pPr>
+              <w:spacing w:before="0" w:after="0" w:line="320" w:lineRule="exact"/>
+              <w:jc w:val="center"/>
+            </w:pPr>
+            <w:r/>
+            <w:r>
+              <w:rPr>
+                <w:rFonts w:ascii="微软雅黑" w:hAnsi="微软雅黑" w:eastAsia="微软雅黑"/>
+                <w:b/>
+                <w:i w:val="0"/>
+                <w:color w:val="FFFFFF"/>
+                <w:sz w:val="18"/>
+              </w:rPr>
+              <w:t>筹码贷 / 手</w:t>
+            </w:r>
+          </w:p>
+        </w:tc>
+        <w:tc>
+          <w:tcPr>
+            <w:tcW w:type="dxa" w:w="1587"/>
+            <w:shd w:fill="1A243A" w:val="clear"/>
+            <w:tcBorders>
+              <w:top w:val="single" w:sz="4" w:space="0" w:color="C8BFA8"/>
+              <w:left w:val="single" w:sz="4" w:space="0" w:color="C8BFA8"/>
+              <w:bottom w:val="single" w:sz="4" w:space="0" w:color="C8BFA8"/>
+              <w:right w:val="single" w:sz="4" w:space="0" w:color="C8BFA8"/>
+            </w:tcBorders>
+            <w:tcMar>
+              <w:top w:w="40" w:type="dxa"/>
+              <w:left w:w="80" w:type="dxa"/>
+              <w:bottom w:w="40" w:type="dxa"/>
+              <w:right w:w="80" w:type="dxa"/>
+            </w:tcMar>
+            <w:vAlign w:val="center"/>
+          </w:tcPr>
+          <w:p>
+            <w:pPr>
+              <w:spacing w:before="0" w:after="0" w:line="320" w:lineRule="exact"/>
+              <w:jc w:val="center"/>
+            </w:pPr>
+            <w:r/>
+            <w:r>
+              <w:rPr>
+                <w:rFonts w:ascii="微软雅黑" w:hAnsi="微软雅黑" w:eastAsia="微软雅黑"/>
+                <w:b/>
+                <w:i w:val="0"/>
+                <w:color w:val="FFFFFF"/>
+                <w:sz w:val="18"/>
+              </w:rPr>
+              <w:t>能量贷 / 手</w:t>
+            </w:r>
+          </w:p>
+        </w:tc>
+        <w:tc>
+          <w:tcPr>
+            <w:tcW w:type="dxa" w:w="3402"/>
+            <w:shd w:fill="1A243A" w:val="clear"/>
+            <w:tcBorders>
+              <w:top w:val="single" w:sz="4" w:space="0" w:color="C8BFA8"/>
+              <w:left w:val="single" w:sz="4" w:space="0" w:color="C8BFA8"/>
+              <w:bottom w:val="single" w:sz="4" w:space="0" w:color="C8BFA8"/>
+              <w:right w:val="single" w:sz="4" w:space="0" w:color="C8BFA8"/>
+            </w:tcBorders>
+            <w:tcMar>
+              <w:top w:w="40" w:type="dxa"/>
+              <w:left w:w="80" w:type="dxa"/>
+              <w:bottom w:w="40" w:type="dxa"/>
+              <w:right w:w="80" w:type="dxa"/>
+            </w:tcMar>
+            <w:vAlign w:val="center"/>
+          </w:tcPr>
+          <w:p>
+            <w:pPr>
+              <w:spacing w:before="0" w:after="0" w:line="320" w:lineRule="exact"/>
+              <w:jc w:val="center"/>
+            </w:pPr>
+            <w:r/>
+            <w:r>
+              <w:rPr>
+                <w:rFonts w:ascii="微软雅黑" w:hAnsi="微软雅黑" w:eastAsia="微软雅黑"/>
+                <w:b/>
+                <w:i w:val="0"/>
+                <w:color w:val="FFFFFF"/>
+                <w:sz w:val="18"/>
+              </w:rPr>
+              <w:t>合计 / 手</w:t>
+            </w:r>
+          </w:p>
+        </w:tc>
+      </w:tr>
+      <w:tr>
+        <w:trPr>
+          <w:cantSplit/>
+        </w:trPr>
+        <w:tc>
+          <w:tcPr>
+            <w:tcW w:type="dxa" w:w="2721"/>
+            <w:shd w:fill="FFFFFF" w:val="clear"/>
+            <w:tcBorders>
+              <w:top w:val="single" w:sz="4" w:space="0" w:color="C8BFA8"/>
+              <w:left w:val="single" w:sz="4" w:space="0" w:color="C8BFA8"/>
+              <w:bottom w:val="single" w:sz="4" w:space="0" w:color="C8BFA8"/>
+              <w:right w:val="single" w:sz="4" w:space="0" w:color="C8BFA8"/>
+            </w:tcBorders>
+            <w:tcMar>
+              <w:top w:w="40" w:type="dxa"/>
+              <w:left w:w="80" w:type="dxa"/>
+              <w:bottom w:w="40" w:type="dxa"/>
+              <w:right w:w="80" w:type="dxa"/>
+            </w:tcMar>
+            <w:vAlign w:val="center"/>
+          </w:tcPr>
+          <w:p>
+            <w:pPr>
+              <w:spacing w:before="0" w:after="0" w:line="320" w:lineRule="exact"/>
+              <w:jc w:val="center"/>
+            </w:pPr>
+            <w:r/>
+            <w:r>
+              <w:rPr>
+                <w:rFonts w:ascii="微软雅黑" w:hAnsi="微软雅黑" w:eastAsia="微软雅黑"/>
+                <w:b w:val="0"/>
+                <w:i w:val="0"/>
+                <w:color w:val="1A243A"/>
+                <w:sz w:val="18"/>
+              </w:rPr>
+              <w:t>NORMAL_CREDIT 正常</w:t>
+            </w:r>
+          </w:p>
+        </w:tc>
+        <w:tc>
+          <w:tcPr>
+            <w:tcW w:type="dxa" w:w="1587"/>
+            <w:shd w:fill="FFFFFF" w:val="clear"/>
+            <w:tcBorders>
+              <w:top w:val="single" w:sz="4" w:space="0" w:color="C8BFA8"/>
+              <w:left w:val="single" w:sz="4" w:space="0" w:color="C8BFA8"/>
+              <w:bottom w:val="single" w:sz="4" w:space="0" w:color="C8BFA8"/>
+              <w:right w:val="single" w:sz="4" w:space="0" w:color="C8BFA8"/>
+            </w:tcBorders>
+            <w:tcMar>
+              <w:top w:w="40" w:type="dxa"/>
+              <w:left w:w="80" w:type="dxa"/>
+              <w:bottom w:w="40" w:type="dxa"/>
+              <w:right w:w="80" w:type="dxa"/>
+            </w:tcMar>
+            <w:vAlign w:val="center"/>
+          </w:tcPr>
+          <w:p>
+            <w:pPr>
+              <w:spacing w:before="0" w:after="0" w:line="320" w:lineRule="exact"/>
+              <w:jc w:val="center"/>
+            </w:pPr>
+            <w:r/>
+            <w:r>
+              <w:rPr>
+                <w:rFonts w:ascii="微软雅黑" w:hAnsi="微软雅黑" w:eastAsia="微软雅黑"/>
+                <w:b w:val="0"/>
+                <w:i w:val="0"/>
+                <w:color w:val="1A243A"/>
+                <w:sz w:val="18"/>
+              </w:rPr>
+              <w:t>2</w:t>
+            </w:r>
+          </w:p>
+        </w:tc>
+        <w:tc>
+          <w:tcPr>
+            <w:tcW w:type="dxa" w:w="1587"/>
+            <w:shd w:fill="FFFFFF" w:val="clear"/>
+            <w:tcBorders>
+              <w:top w:val="single" w:sz="4" w:space="0" w:color="C8BFA8"/>
+              <w:left w:val="single" w:sz="4" w:space="0" w:color="C8BFA8"/>
+              <w:bottom w:val="single" w:sz="4" w:space="0" w:color="C8BFA8"/>
+              <w:right w:val="single" w:sz="4" w:space="0" w:color="C8BFA8"/>
+            </w:tcBorders>
+            <w:tcMar>
+              <w:top w:w="40" w:type="dxa"/>
+              <w:left w:w="80" w:type="dxa"/>
+              <w:bottom w:w="40" w:type="dxa"/>
+              <w:right w:w="80" w:type="dxa"/>
+            </w:tcMar>
+            <w:vAlign w:val="center"/>
+          </w:tcPr>
+          <w:p>
+            <w:pPr>
+              <w:spacing w:before="0" w:after="0" w:line="320" w:lineRule="exact"/>
+              <w:jc w:val="center"/>
+            </w:pPr>
+            <w:r/>
+            <w:r>
+              <w:rPr>
+                <w:rFonts w:ascii="微软雅黑" w:hAnsi="微软雅黑" w:eastAsia="微软雅黑"/>
+                <w:b w:val="0"/>
+                <w:i w:val="0"/>
+                <w:color w:val="1A243A"/>
+                <w:sz w:val="18"/>
+              </w:rPr>
+              <w:t>1</w:t>
+            </w:r>
+          </w:p>
+        </w:tc>
+        <w:tc>
+          <w:tcPr>
+            <w:tcW w:type="dxa" w:w="3402"/>
+            <w:shd w:fill="FFFFFF" w:val="clear"/>
+            <w:tcBorders>
+              <w:top w:val="single" w:sz="4" w:space="0" w:color="C8BFA8"/>
+              <w:left w:val="single" w:sz="4" w:space="0" w:color="C8BFA8"/>
+              <w:bottom w:val="single" w:sz="4" w:space="0" w:color="C8BFA8"/>
+              <w:right w:val="single" w:sz="4" w:space="0" w:color="C8BFA8"/>
+            </w:tcBorders>
+            <w:tcMar>
+              <w:top w:w="40" w:type="dxa"/>
+              <w:left w:w="80" w:type="dxa"/>
+              <w:bottom w:w="40" w:type="dxa"/>
+              <w:right w:w="80" w:type="dxa"/>
+            </w:tcMar>
+            <w:vAlign w:val="center"/>
+          </w:tcPr>
+          <w:p>
+            <w:pPr>
+              <w:spacing w:before="0" w:after="0" w:line="320" w:lineRule="exact"/>
+              <w:jc w:val="left"/>
+            </w:pPr>
+            <w:r/>
+            <w:r>
+              <w:rPr>
+                <w:rFonts w:ascii="微软雅黑" w:hAnsi="微软雅黑" w:eastAsia="微软雅黑"/>
+                <w:b w:val="0"/>
+                <w:i w:val="0"/>
+                <w:color w:val="1A243A"/>
+                <w:sz w:val="18"/>
+              </w:rPr>
+              <w:t>3</w:t>
+            </w:r>
+          </w:p>
+        </w:tc>
+      </w:tr>
+      <w:tr>
+        <w:trPr>
+          <w:cantSplit/>
+        </w:trPr>
+        <w:tc>
+          <w:tcPr>
+            <w:tcW w:type="dxa" w:w="2721"/>
+            <w:shd w:fill="FFFFFF" w:val="clear"/>
+            <w:tcBorders>
+              <w:top w:val="single" w:sz="4" w:space="0" w:color="C8BFA8"/>
+              <w:left w:val="single" w:sz="4" w:space="0" w:color="C8BFA8"/>
+              <w:bottom w:val="single" w:sz="4" w:space="0" w:color="C8BFA8"/>
+              <w:right w:val="single" w:sz="4" w:space="0" w:color="C8BFA8"/>
+            </w:tcBorders>
+            <w:tcMar>
+              <w:top w:w="40" w:type="dxa"/>
+              <w:left w:w="80" w:type="dxa"/>
+              <w:bottom w:w="40" w:type="dxa"/>
+              <w:right w:w="80" w:type="dxa"/>
+            </w:tcMar>
+            <w:vAlign w:val="center"/>
+            <w:shd w:fill="F4F1EA" w:val="clear"/>
+          </w:tcPr>
+          <w:p>
+            <w:pPr>
+              <w:spacing w:before="0" w:after="0" w:line="320" w:lineRule="exact"/>
+              <w:jc w:val="center"/>
+            </w:pPr>
+            <w:r/>
+            <w:r>
+              <w:rPr>
+                <w:rFonts w:ascii="微软雅黑" w:hAnsi="微软雅黑" w:eastAsia="微软雅黑"/>
+                <w:b w:val="0"/>
+                <w:i w:val="0"/>
+                <w:color w:val="1A243A"/>
+                <w:sz w:val="18"/>
+              </w:rPr>
+              <w:t>RESTRICTED_CREDIT 受限</w:t>
+            </w:r>
+          </w:p>
+        </w:tc>
+        <w:tc>
+          <w:tcPr>
+            <w:tcW w:type="dxa" w:w="1587"/>
+            <w:shd w:fill="FFFFFF" w:val="clear"/>
+            <w:tcBorders>
+              <w:top w:val="single" w:sz="4" w:space="0" w:color="C8BFA8"/>
+              <w:left w:val="single" w:sz="4" w:space="0" w:color="C8BFA8"/>
+              <w:bottom w:val="single" w:sz="4" w:space="0" w:color="C8BFA8"/>
+              <w:right w:val="single" w:sz="4" w:space="0" w:color="C8BFA8"/>
+            </w:tcBorders>
+            <w:tcMar>
+              <w:top w:w="40" w:type="dxa"/>
+              <w:left w:w="80" w:type="dxa"/>
+              <w:bottom w:w="40" w:type="dxa"/>
+              <w:right w:w="80" w:type="dxa"/>
+            </w:tcMar>
+            <w:vAlign w:val="center"/>
+            <w:shd w:fill="F4F1EA" w:val="clear"/>
+          </w:tcPr>
+          <w:p>
+            <w:pPr>
+              <w:spacing w:before="0" w:after="0" w:line="320" w:lineRule="exact"/>
+              <w:jc w:val="center"/>
+            </w:pPr>
+            <w:r/>
+            <w:r>
+              <w:rPr>
+                <w:rFonts w:ascii="微软雅黑" w:hAnsi="微软雅黑" w:eastAsia="微软雅黑"/>
+                <w:b w:val="0"/>
+                <w:i w:val="0"/>
+                <w:color w:val="1A243A"/>
+                <w:sz w:val="18"/>
+              </w:rPr>
+              <w:t>1</w:t>
+            </w:r>
+          </w:p>
+        </w:tc>
+        <w:tc>
+          <w:tcPr>
+            <w:tcW w:type="dxa" w:w="1587"/>
+            <w:shd w:fill="FFFFFF" w:val="clear"/>
+            <w:tcBorders>
+              <w:top w:val="single" w:sz="4" w:space="0" w:color="C8BFA8"/>
+              <w:left w:val="single" w:sz="4" w:space="0" w:color="C8BFA8"/>
+              <w:bottom w:val="single" w:sz="4" w:space="0" w:color="C8BFA8"/>
+              <w:right w:val="single" w:sz="4" w:space="0" w:color="C8BFA8"/>
+            </w:tcBorders>
+            <w:tcMar>
+              <w:top w:w="40" w:type="dxa"/>
+              <w:left w:w="80" w:type="dxa"/>
+              <w:bottom w:w="40" w:type="dxa"/>
+              <w:right w:w="80" w:type="dxa"/>
+            </w:tcMar>
+            <w:vAlign w:val="center"/>
+            <w:shd w:fill="F4F1EA" w:val="clear"/>
+          </w:tcPr>
+          <w:p>
+            <w:pPr>
+              <w:spacing w:before="0" w:after="0" w:line="320" w:lineRule="exact"/>
+              <w:jc w:val="center"/>
+            </w:pPr>
+            <w:r/>
+            <w:r>
+              <w:rPr>
+                <w:rFonts w:ascii="微软雅黑" w:hAnsi="微软雅黑" w:eastAsia="微软雅黑"/>
+                <w:b w:val="0"/>
+                <w:i w:val="0"/>
+                <w:color w:val="1A243A"/>
+                <w:sz w:val="18"/>
+              </w:rPr>
+              <w:t>1</w:t>
+            </w:r>
+          </w:p>
+        </w:tc>
+        <w:tc>
+          <w:tcPr>
+            <w:tcW w:type="dxa" w:w="3402"/>
+            <w:shd w:fill="FFFFFF" w:val="clear"/>
+            <w:tcBorders>
+              <w:top w:val="single" w:sz="4" w:space="0" w:color="C8BFA8"/>
+              <w:left w:val="single" w:sz="4" w:space="0" w:color="C8BFA8"/>
+              <w:bottom w:val="single" w:sz="4" w:space="0" w:color="C8BFA8"/>
+              <w:right w:val="single" w:sz="4" w:space="0" w:color="C8BFA8"/>
+            </w:tcBorders>
+            <w:tcMar>
+              <w:top w:w="40" w:type="dxa"/>
+              <w:left w:w="80" w:type="dxa"/>
+              <w:bottom w:w="40" w:type="dxa"/>
+              <w:right w:w="80" w:type="dxa"/>
+            </w:tcMar>
+            <w:vAlign w:val="center"/>
+            <w:shd w:fill="F4F1EA" w:val="clear"/>
+          </w:tcPr>
+          <w:p>
+            <w:pPr>
+              <w:spacing w:before="0" w:after="0" w:line="320" w:lineRule="exact"/>
+              <w:jc w:val="left"/>
+            </w:pPr>
+            <w:r/>
+            <w:r>
+              <w:rPr>
+                <w:rFonts w:ascii="微软雅黑" w:hAnsi="微软雅黑" w:eastAsia="微软雅黑"/>
+                <w:b w:val="0"/>
+                <w:i w:val="0"/>
+                <w:color w:val="1A243A"/>
+                <w:sz w:val="18"/>
+              </w:rPr>
+              <w:t>1（整手只能选一个模式发动一次）</w:t>
+            </w:r>
+          </w:p>
+        </w:tc>
+      </w:tr>
+      <w:tr>
+        <w:trPr>
+          <w:cantSplit/>
+        </w:trPr>
+        <w:tc>
+          <w:tcPr>
+            <w:tcW w:type="dxa" w:w="2721"/>
+            <w:shd w:fill="FFFFFF" w:val="clear"/>
+            <w:tcBorders>
+              <w:top w:val="single" w:sz="4" w:space="0" w:color="C8BFA8"/>
+              <w:left w:val="single" w:sz="4" w:space="0" w:color="C8BFA8"/>
+              <w:bottom w:val="single" w:sz="4" w:space="0" w:color="C8BFA8"/>
+              <w:right w:val="single" w:sz="4" w:space="0" w:color="C8BFA8"/>
+            </w:tcBorders>
+            <w:tcMar>
+              <w:top w:w="40" w:type="dxa"/>
+              <w:left w:w="80" w:type="dxa"/>
+              <w:bottom w:w="40" w:type="dxa"/>
+              <w:right w:w="80" w:type="dxa"/>
+            </w:tcMar>
+            <w:vAlign w:val="center"/>
+          </w:tcPr>
+          <w:p>
+            <w:pPr>
+              <w:spacing w:before="0" w:after="0" w:line="320" w:lineRule="exact"/>
+              <w:jc w:val="center"/>
+            </w:pPr>
+            <w:r/>
+            <w:r>
+              <w:rPr>
+                <w:rFonts w:ascii="微软雅黑" w:hAnsi="微软雅黑" w:eastAsia="微软雅黑"/>
+                <w:b w:val="0"/>
+                <w:i w:val="0"/>
+                <w:color w:val="1A243A"/>
+                <w:sz w:val="18"/>
+              </w:rPr>
+              <w:t>DEFAULTED 违约</w:t>
+            </w:r>
+          </w:p>
+        </w:tc>
+        <w:tc>
+          <w:tcPr>
+            <w:tcW w:type="dxa" w:w="1587"/>
+            <w:shd w:fill="FFFFFF" w:val="clear"/>
+            <w:tcBorders>
+              <w:top w:val="single" w:sz="4" w:space="0" w:color="C8BFA8"/>
+              <w:left w:val="single" w:sz="4" w:space="0" w:color="C8BFA8"/>
+              <w:bottom w:val="single" w:sz="4" w:space="0" w:color="C8BFA8"/>
+              <w:right w:val="single" w:sz="4" w:space="0" w:color="C8BFA8"/>
+            </w:tcBorders>
+            <w:tcMar>
+              <w:top w:w="40" w:type="dxa"/>
+              <w:left w:w="80" w:type="dxa"/>
+              <w:bottom w:w="40" w:type="dxa"/>
+              <w:right w:w="80" w:type="dxa"/>
+            </w:tcMar>
+            <w:vAlign w:val="center"/>
+          </w:tcPr>
+          <w:p>
+            <w:pPr>
+              <w:spacing w:before="0" w:after="0" w:line="320" w:lineRule="exact"/>
+              <w:jc w:val="center"/>
+            </w:pPr>
+            <w:r/>
+            <w:r>
+              <w:rPr>
+                <w:rFonts w:ascii="微软雅黑" w:hAnsi="微软雅黑" w:eastAsia="微软雅黑"/>
+                <w:b w:val="0"/>
+                <w:i w:val="0"/>
+                <w:color w:val="1A243A"/>
+                <w:sz w:val="18"/>
+              </w:rPr>
+              <w:t>0</w:t>
+            </w:r>
+          </w:p>
+        </w:tc>
+        <w:tc>
+          <w:tcPr>
+            <w:tcW w:type="dxa" w:w="1587"/>
+            <w:shd w:fill="FFFFFF" w:val="clear"/>
+            <w:tcBorders>
+              <w:top w:val="single" w:sz="4" w:space="0" w:color="C8BFA8"/>
+              <w:left w:val="single" w:sz="4" w:space="0" w:color="C8BFA8"/>
+              <w:bottom w:val="single" w:sz="4" w:space="0" w:color="C8BFA8"/>
+              <w:right w:val="single" w:sz="4" w:space="0" w:color="C8BFA8"/>
+            </w:tcBorders>
+            <w:tcMar>
+              <w:top w:w="40" w:type="dxa"/>
+              <w:left w:w="80" w:type="dxa"/>
+              <w:bottom w:w="40" w:type="dxa"/>
+              <w:right w:w="80" w:type="dxa"/>
+            </w:tcMar>
+            <w:vAlign w:val="center"/>
+          </w:tcPr>
+          <w:p>
+            <w:pPr>
+              <w:spacing w:before="0" w:after="0" w:line="320" w:lineRule="exact"/>
+              <w:jc w:val="center"/>
+            </w:pPr>
+            <w:r/>
+            <w:r>
+              <w:rPr>
+                <w:rFonts w:ascii="微软雅黑" w:hAnsi="微软雅黑" w:eastAsia="微软雅黑"/>
+                <w:b w:val="0"/>
+                <w:i w:val="0"/>
+                <w:color w:val="1A243A"/>
+                <w:sz w:val="18"/>
+              </w:rPr>
+              <w:t>0</w:t>
+            </w:r>
+          </w:p>
+        </w:tc>
+        <w:tc>
+          <w:tcPr>
+            <w:tcW w:type="dxa" w:w="3402"/>
+            <w:shd w:fill="FFFFFF" w:val="clear"/>
+            <w:tcBorders>
+              <w:top w:val="single" w:sz="4" w:space="0" w:color="C8BFA8"/>
+              <w:left w:val="single" w:sz="4" w:space="0" w:color="C8BFA8"/>
+              <w:bottom w:val="single" w:sz="4" w:space="0" w:color="C8BFA8"/>
+              <w:right w:val="single" w:sz="4" w:space="0" w:color="C8BFA8"/>
+            </w:tcBorders>
+            <w:tcMar>
+              <w:top w:w="40" w:type="dxa"/>
+              <w:left w:w="80" w:type="dxa"/>
+              <w:bottom w:w="40" w:type="dxa"/>
+              <w:right w:w="80" w:type="dxa"/>
+            </w:tcMar>
+            <w:vAlign w:val="center"/>
+          </w:tcPr>
+          <w:p>
+            <w:pPr>
+              <w:spacing w:before="0" w:after="0" w:line="320" w:lineRule="exact"/>
+              <w:jc w:val="left"/>
+            </w:pPr>
+            <w:r/>
+            <w:r>
+              <w:rPr>
+                <w:rFonts w:ascii="微软雅黑" w:hAnsi="微软雅黑" w:eastAsia="微软雅黑"/>
+                <w:b w:val="0"/>
+                <w:i w:val="0"/>
+                <w:color w:val="1A243A"/>
+                <w:sz w:val="18"/>
+              </w:rPr>
+              <w:t>0（整技能不可发动）</w:t>
+            </w:r>
+          </w:p>
+        </w:tc>
+      </w:tr>
+    </w:tbl>
+    <w:p>
+      <w:pPr>
+        <w:spacing w:before="0" w:after="160" w:line="120" w:lineRule="exact"/>
+      </w:pPr>
     </w:p>
     <w:p>
       <w:pPr>
@@ -12073,7 +14290,7 @@
           <w:color w:val="1A243A"/>
           <w:sz w:val="21"/>
         </w:rPr>
-        <w:t>• 两种贷款可以同时存在。</w:t>
+        <w:t>• 任意偿还失败形成的 chipDebt 或 energyDebt 未清偿时，进入 DEFAULTED，整技能封禁。</w:t>
       </w:r>
     </w:p>
     <w:p>
@@ -12089,23 +14306,7 @@
           <w:color w:val="1A243A"/>
           <w:sz w:val="21"/>
         </w:rPr>
-        <w:t>• 任意偿还失败形成的筹码债务或能量债务未清偿时，进入违约，整技能封禁。</w:t>
-      </w:r>
-    </w:p>
-    <w:p>
-      <w:pPr>
-        <w:spacing w:before="20" w:after="40" w:line="340" w:lineRule="exact"/>
-        <w:ind w:left="425" w:hanging="255"/>
-      </w:pPr>
-      <w:r>
-        <w:rPr>
-          <w:rFonts w:ascii="微软雅黑" w:hAnsi="微软雅黑" w:eastAsia="微软雅黑"/>
-          <w:b w:val="0"/>
-          <w:i w:val="0"/>
-          <w:color w:val="1A243A"/>
-          <w:sz w:val="21"/>
-        </w:rPr>
-        <w:t>• 只有从玩家筹码 / 能量中真实扣除才算偿还。公平清除、比赛结束失效或其他免除都不算实际偿还。</w:t>
+        <w:t>• 只有从玩家筹码 / 能量中真实扣除才算偿还。公平清除、比赛结束失效、调试重置、状态覆盖、其他技能免除都不算实际偿还。</w:t>
       </w:r>
     </w:p>
     <w:p>
@@ -12265,7 +14466,7 @@
           <w:color w:val="1A243A"/>
           <w:sz w:val="21"/>
         </w:rPr>
-        <w:t>信用状态</w:t>
+        <w:t>信用转移</w:t>
       </w:r>
     </w:p>
     <w:p>
@@ -12281,55 +14482,7 @@
           <w:color w:val="1A243A"/>
           <w:sz w:val="21"/>
         </w:rPr>
-        <w:t>• NORMAL_CREDIT：正常额度 2+1，合计 3。</w:t>
-      </w:r>
-    </w:p>
-    <w:p>
-      <w:pPr>
-        <w:spacing w:before="20" w:after="40" w:line="340" w:lineRule="exact"/>
-        <w:ind w:left="425" w:hanging="255"/>
-      </w:pPr>
-      <w:r>
-        <w:rPr>
-          <w:rFonts w:ascii="微软雅黑" w:hAnsi="微软雅黑" w:eastAsia="微软雅黑"/>
-          <w:b w:val="0"/>
-          <w:i w:val="0"/>
-          <w:color w:val="1A243A"/>
-          <w:sz w:val="21"/>
-        </w:rPr>
-        <w:t>• RESTRICTED_CREDIT：整手贷款合计 1 次。</w:t>
-      </w:r>
-    </w:p>
-    <w:p>
-      <w:pPr>
-        <w:spacing w:before="20" w:after="40" w:line="340" w:lineRule="exact"/>
-        <w:ind w:left="425" w:hanging="255"/>
-      </w:pPr>
-      <w:r>
-        <w:rPr>
-          <w:rFonts w:ascii="微软雅黑" w:hAnsi="微软雅黑" w:eastAsia="微软雅黑"/>
-          <w:b w:val="0"/>
-          <w:i w:val="0"/>
-          <w:color w:val="1A243A"/>
-          <w:sz w:val="21"/>
-        </w:rPr>
-        <w:t>• DEFAULTED：整技能不可发动，直到 residual 被处理。</w:t>
-      </w:r>
-    </w:p>
-    <w:p>
-      <w:pPr>
-        <w:spacing w:before="20" w:after="40" w:line="340" w:lineRule="exact"/>
-        <w:ind w:left="425" w:hanging="255"/>
-      </w:pPr>
-      <w:r>
-        <w:rPr>
-          <w:rFonts w:ascii="微软雅黑" w:hAnsi="微软雅黑" w:eastAsia="微软雅黑"/>
-          <w:b w:val="0"/>
-          <w:i w:val="0"/>
-          <w:color w:val="1A243A"/>
-          <w:sz w:val="21"/>
-        </w:rPr>
-        <w:t>• 任何 pending / residual 金额大于 0 被公平或其他非真实偿还机制清除 → 信用受限。</w:t>
+        <w:t>• 任何已存在的 pending / residual 贷款债务金额 &gt; 0 被公平或其他非真实偿还机制清除 → RESTRICTED_CREDIT。</w:t>
       </w:r>
     </w:p>
     <w:p>
@@ -12361,7 +14514,7 @@
           <w:color w:val="1A243A"/>
           <w:sz w:val="21"/>
         </w:rPr>
-        <w:t>• 到期无法全额真实偿还并形成 residual → 违约。</w:t>
+        <w:t>• 到期无法全额真实偿还并形成 residual &gt; 0 → DEFAULTED。</w:t>
       </w:r>
     </w:p>
     <w:p>
@@ -12377,7 +14530,7 @@
           <w:color w:val="1A243A"/>
           <w:sz w:val="21"/>
         </w:rPr>
-        <w:t>• 受限后恢复正常，必须是受限下新借、正常到期、全部真实支付、无免除、residual 为 0。部分真实偿还后剩余被公平清除，不算恢复。</w:t>
+        <w:t>• 受限后恢复正常，必须同时满足：这笔贷款在受限状态下新产生；正常到期；到期时全部用真实资源支付；没有任何部分被免除；最终 residual == 0。部分真实偿还后剩余被公平清除，不算恢复。</w:t>
       </w:r>
     </w:p>
     <w:p>
@@ -12393,7 +14546,7 @@
           <w:color w:val="1A243A"/>
           <w:sz w:val="21"/>
         </w:rPr>
-        <w:t>• 违约后 residual 被真实全部还清 → 正常信用；被公平清除 → 信用受限，不是洗白。</w:t>
+        <w:t>• 违约后 residual 被真实全部还清 → NORMAL_CREDIT。</w:t>
       </w:r>
     </w:p>
     <w:p>
@@ -12409,7 +14562,7 @@
           <w:color w:val="1A243A"/>
           <w:sz w:val="21"/>
         </w:rPr>
-        <w:t>• 反制抓住贷款：费用照付，不获得资源，不生成债务，不改变信用。</w:t>
+        <w:t>• 违约后 residual 被公平清除 → RESTRICTED_CREDIT，贷款重新可用，但不是洗白。</w:t>
       </w:r>
     </w:p>
     <w:p>
@@ -12425,7 +14578,23 @@
           <w:color w:val="1A243A"/>
           <w:sz w:val="21"/>
         </w:rPr>
-        <w:t>• 信用状态不跨 Match。比赛合法结束后全部清空，下一场从正常信用开始。</w:t>
+        <w:t>• 反制抓住贷款：费用照付，不获得资源，不生成偿还或 residual，不改变信用。</w:t>
+      </w:r>
+    </w:p>
+    <w:p>
+      <w:pPr>
+        <w:spacing w:before="20" w:after="40" w:line="340" w:lineRule="exact"/>
+        <w:ind w:left="425" w:hanging="255"/>
+      </w:pPr>
+      <w:r>
+        <w:rPr>
+          <w:rFonts w:ascii="微软雅黑" w:hAnsi="微软雅黑" w:eastAsia="微软雅黑"/>
+          <w:b w:val="0"/>
+          <w:i w:val="0"/>
+          <w:color w:val="1A243A"/>
+          <w:sz w:val="21"/>
+        </w:rPr>
+        <w:t>• 整场比赛合法结束后：未到期偿还、residual、信用状态全部清空；下一场从正常信用开始。</w:t>
       </w:r>
     </w:p>
     <w:p>
@@ -17427,7 +19596,7 @@
         <w:color w:val="4A5260"/>
         <w:sz w:val="16"/>
       </w:rPr>
-      <w:t xml:space="preserve">实现版基线  ·  与当前代码一致  ·  2026-08-21  ·  第 </w:t>
+      <w:t xml:space="preserve">实现版基线  ·  与当前代码一致  ·  2026-08-22  ·  第 </w:t>
     </w:r>
     <w:r>
       <w:rPr>

</xml_diff>